<commit_message>
trying to make an encryption decryption algorithm
</commit_message>
<xml_diff>
--- a/COMP1004-Report.docx
+++ b/COMP1004-Report.docx
@@ -105,7 +105,11 @@
               <w:tab w:val="right" w:leader="dot" w:pos="9016"/>
             </w:tabs>
             <w:rPr>
+              <w:rFonts w:eastAsiaTheme="minorEastAsia"/>
               <w:noProof/>
+              <w:sz w:val="24"/>
+              <w:szCs w:val="24"/>
+              <w:lang w:eastAsia="en-GB"/>
             </w:rPr>
           </w:pPr>
           <w:r>
@@ -117,7 +121,7 @@
           <w:r>
             <w:fldChar w:fldCharType="separate"/>
           </w:r>
-          <w:hyperlink w:anchor="_Toc222398034" w:history="1">
+          <w:hyperlink w:anchor="_Toc224815308" w:history="1">
             <w:r>
               <w:rPr>
                 <w:rStyle w:val="Hyperlink"/>
@@ -144,7 +148,7 @@
                 <w:noProof/>
                 <w:webHidden/>
               </w:rPr>
-              <w:instrText xml:space="preserve"> PAGEREF _Toc222398034 \h </w:instrText>
+              <w:instrText xml:space="preserve"> PAGEREF _Toc224815308 \h </w:instrText>
             </w:r>
             <w:r>
               <w:rPr>
@@ -182,10 +186,14 @@
               <w:tab w:val="right" w:leader="dot" w:pos="9016"/>
             </w:tabs>
             <w:rPr>
+              <w:rFonts w:eastAsiaTheme="minorEastAsia"/>
               <w:noProof/>
+              <w:sz w:val="24"/>
+              <w:szCs w:val="24"/>
+              <w:lang w:eastAsia="en-GB"/>
             </w:rPr>
           </w:pPr>
-          <w:hyperlink w:anchor="_Toc222398035" w:history="1">
+          <w:hyperlink w:anchor="_Toc224815309" w:history="1">
             <w:r>
               <w:rPr>
                 <w:rStyle w:val="Hyperlink"/>
@@ -212,7 +220,7 @@
                 <w:noProof/>
                 <w:webHidden/>
               </w:rPr>
-              <w:instrText xml:space="preserve"> PAGEREF _Toc222398035 \h </w:instrText>
+              <w:instrText xml:space="preserve"> PAGEREF _Toc224815309 \h </w:instrText>
             </w:r>
             <w:r>
               <w:rPr>
@@ -250,10 +258,14 @@
               <w:tab w:val="right" w:leader="dot" w:pos="9016"/>
             </w:tabs>
             <w:rPr>
+              <w:rFonts w:eastAsiaTheme="minorEastAsia"/>
               <w:noProof/>
+              <w:sz w:val="24"/>
+              <w:szCs w:val="24"/>
+              <w:lang w:eastAsia="en-GB"/>
             </w:rPr>
           </w:pPr>
-          <w:hyperlink w:anchor="_Toc222398036" w:history="1">
+          <w:hyperlink w:anchor="_Toc224815310" w:history="1">
             <w:r>
               <w:rPr>
                 <w:rStyle w:val="Hyperlink"/>
@@ -280,7 +292,7 @@
                 <w:noProof/>
                 <w:webHidden/>
               </w:rPr>
-              <w:instrText xml:space="preserve"> PAGEREF _Toc222398036 \h </w:instrText>
+              <w:instrText xml:space="preserve"> PAGEREF _Toc224815310 \h </w:instrText>
             </w:r>
             <w:r>
               <w:rPr>
@@ -318,10 +330,14 @@
               <w:tab w:val="right" w:leader="dot" w:pos="9016"/>
             </w:tabs>
             <w:rPr>
+              <w:rFonts w:eastAsiaTheme="minorEastAsia"/>
               <w:noProof/>
+              <w:sz w:val="24"/>
+              <w:szCs w:val="24"/>
+              <w:lang w:eastAsia="en-GB"/>
             </w:rPr>
           </w:pPr>
-          <w:hyperlink w:anchor="_Toc222398037" w:history="1">
+          <w:hyperlink w:anchor="_Toc224815311" w:history="1">
             <w:r>
               <w:rPr>
                 <w:rStyle w:val="Hyperlink"/>
@@ -348,7 +364,7 @@
                 <w:noProof/>
                 <w:webHidden/>
               </w:rPr>
-              <w:instrText xml:space="preserve"> PAGEREF _Toc222398037 \h </w:instrText>
+              <w:instrText xml:space="preserve"> PAGEREF _Toc224815311 \h </w:instrText>
             </w:r>
             <w:r>
               <w:rPr>
@@ -386,10 +402,14 @@
               <w:tab w:val="right" w:leader="dot" w:pos="9016"/>
             </w:tabs>
             <w:rPr>
+              <w:rFonts w:eastAsiaTheme="minorEastAsia"/>
               <w:noProof/>
+              <w:sz w:val="24"/>
+              <w:szCs w:val="24"/>
+              <w:lang w:eastAsia="en-GB"/>
             </w:rPr>
           </w:pPr>
-          <w:hyperlink w:anchor="_Toc222398038" w:history="1">
+          <w:hyperlink w:anchor="_Toc224815312" w:history="1">
             <w:r>
               <w:rPr>
                 <w:rStyle w:val="Hyperlink"/>
@@ -416,7 +436,7 @@
                 <w:noProof/>
                 <w:webHidden/>
               </w:rPr>
-              <w:instrText xml:space="preserve"> PAGEREF _Toc222398038 \h </w:instrText>
+              <w:instrText xml:space="preserve"> PAGEREF _Toc224815312 \h </w:instrText>
             </w:r>
             <w:r>
               <w:rPr>
@@ -454,16 +474,20 @@
               <w:tab w:val="right" w:leader="dot" w:pos="9016"/>
             </w:tabs>
             <w:rPr>
+              <w:rFonts w:eastAsiaTheme="minorEastAsia"/>
               <w:noProof/>
+              <w:sz w:val="24"/>
+              <w:szCs w:val="24"/>
+              <w:lang w:eastAsia="en-GB"/>
             </w:rPr>
           </w:pPr>
-          <w:hyperlink w:anchor="_Toc222398039" w:history="1">
+          <w:hyperlink w:anchor="_Toc224815313" w:history="1">
             <w:r>
               <w:rPr>
                 <w:rStyle w:val="Hyperlink"/>
                 <w:noProof/>
               </w:rPr>
-              <w:t>UML diagrams etc</w:t>
+              <w:t>UML diagrams</w:t>
             </w:r>
             <w:r>
               <w:rPr>
@@ -484,7 +508,7 @@
                 <w:noProof/>
                 <w:webHidden/>
               </w:rPr>
-              <w:instrText xml:space="preserve"> PAGEREF _Toc222398039 \h </w:instrText>
+              <w:instrText xml:space="preserve"> PAGEREF _Toc224815313 \h </w:instrText>
             </w:r>
             <w:r>
               <w:rPr>
@@ -504,7 +528,288 @@
                 <w:noProof/>
                 <w:webHidden/>
               </w:rPr>
-              <w:t>3</w:t>
+              <w:t>4</w:t>
+            </w:r>
+            <w:r>
+              <w:rPr>
+                <w:noProof/>
+                <w:webHidden/>
+              </w:rPr>
+              <w:fldChar w:fldCharType="end"/>
+            </w:r>
+          </w:hyperlink>
+        </w:p>
+        <w:p>
+          <w:pPr>
+            <w:pStyle w:val="TOC3"/>
+            <w:tabs>
+              <w:tab w:val="right" w:leader="dot" w:pos="9016"/>
+            </w:tabs>
+            <w:rPr>
+              <w:rFonts w:eastAsiaTheme="minorEastAsia"/>
+              <w:noProof/>
+              <w:sz w:val="24"/>
+              <w:szCs w:val="24"/>
+              <w:lang w:eastAsia="en-GB"/>
+            </w:rPr>
+          </w:pPr>
+          <w:hyperlink w:anchor="_Toc224815314" w:history="1">
+            <w:r>
+              <w:rPr>
+                <w:rStyle w:val="Hyperlink"/>
+                <w:noProof/>
+              </w:rPr>
+              <w:t>Sitemap</w:t>
+            </w:r>
+            <w:r>
+              <w:rPr>
+                <w:noProof/>
+                <w:webHidden/>
+              </w:rPr>
+              <w:tab/>
+            </w:r>
+            <w:r>
+              <w:rPr>
+                <w:noProof/>
+                <w:webHidden/>
+              </w:rPr>
+              <w:fldChar w:fldCharType="begin"/>
+            </w:r>
+            <w:r>
+              <w:rPr>
+                <w:noProof/>
+                <w:webHidden/>
+              </w:rPr>
+              <w:instrText xml:space="preserve"> PAGEREF _Toc224815314 \h </w:instrText>
+            </w:r>
+            <w:r>
+              <w:rPr>
+                <w:noProof/>
+                <w:webHidden/>
+              </w:rPr>
+            </w:r>
+            <w:r>
+              <w:rPr>
+                <w:noProof/>
+                <w:webHidden/>
+              </w:rPr>
+              <w:fldChar w:fldCharType="separate"/>
+            </w:r>
+            <w:r>
+              <w:rPr>
+                <w:noProof/>
+                <w:webHidden/>
+              </w:rPr>
+              <w:t>4</w:t>
+            </w:r>
+            <w:r>
+              <w:rPr>
+                <w:noProof/>
+                <w:webHidden/>
+              </w:rPr>
+              <w:fldChar w:fldCharType="end"/>
+            </w:r>
+          </w:hyperlink>
+        </w:p>
+        <w:p>
+          <w:pPr>
+            <w:pStyle w:val="TOC3"/>
+            <w:tabs>
+              <w:tab w:val="right" w:leader="dot" w:pos="9016"/>
+            </w:tabs>
+            <w:rPr>
+              <w:rFonts w:eastAsiaTheme="minorEastAsia"/>
+              <w:noProof/>
+              <w:sz w:val="24"/>
+              <w:szCs w:val="24"/>
+              <w:lang w:eastAsia="en-GB"/>
+            </w:rPr>
+          </w:pPr>
+          <w:hyperlink w:anchor="_Toc224815315" w:history="1">
+            <w:r>
+              <w:rPr>
+                <w:rStyle w:val="Hyperlink"/>
+                <w:noProof/>
+              </w:rPr>
+              <w:t>Wireframes</w:t>
+            </w:r>
+            <w:r>
+              <w:rPr>
+                <w:noProof/>
+                <w:webHidden/>
+              </w:rPr>
+              <w:tab/>
+            </w:r>
+            <w:r>
+              <w:rPr>
+                <w:noProof/>
+                <w:webHidden/>
+              </w:rPr>
+              <w:fldChar w:fldCharType="begin"/>
+            </w:r>
+            <w:r>
+              <w:rPr>
+                <w:noProof/>
+                <w:webHidden/>
+              </w:rPr>
+              <w:instrText xml:space="preserve"> PAGEREF _Toc224815315 \h </w:instrText>
+            </w:r>
+            <w:r>
+              <w:rPr>
+                <w:noProof/>
+                <w:webHidden/>
+              </w:rPr>
+            </w:r>
+            <w:r>
+              <w:rPr>
+                <w:noProof/>
+                <w:webHidden/>
+              </w:rPr>
+              <w:fldChar w:fldCharType="separate"/>
+            </w:r>
+            <w:r>
+              <w:rPr>
+                <w:noProof/>
+                <w:webHidden/>
+              </w:rPr>
+              <w:t>5</w:t>
+            </w:r>
+            <w:r>
+              <w:rPr>
+                <w:noProof/>
+                <w:webHidden/>
+              </w:rPr>
+              <w:fldChar w:fldCharType="end"/>
+            </w:r>
+          </w:hyperlink>
+        </w:p>
+        <w:p>
+          <w:pPr>
+            <w:pStyle w:val="TOC1"/>
+            <w:tabs>
+              <w:tab w:val="right" w:leader="dot" w:pos="9016"/>
+            </w:tabs>
+            <w:rPr>
+              <w:rFonts w:eastAsiaTheme="minorEastAsia"/>
+              <w:noProof/>
+              <w:sz w:val="24"/>
+              <w:szCs w:val="24"/>
+              <w:lang w:eastAsia="en-GB"/>
+            </w:rPr>
+          </w:pPr>
+          <w:hyperlink w:anchor="_Toc224815316" w:history="1">
+            <w:r>
+              <w:rPr>
+                <w:noProof/>
+                <w:webHidden/>
+              </w:rPr>
+              <w:tab/>
+            </w:r>
+            <w:r>
+              <w:rPr>
+                <w:noProof/>
+                <w:webHidden/>
+              </w:rPr>
+              <w:fldChar w:fldCharType="begin"/>
+            </w:r>
+            <w:r>
+              <w:rPr>
+                <w:noProof/>
+                <w:webHidden/>
+              </w:rPr>
+              <w:instrText xml:space="preserve"> PAGEREF _Toc224815316 \h </w:instrText>
+            </w:r>
+            <w:r>
+              <w:rPr>
+                <w:noProof/>
+                <w:webHidden/>
+              </w:rPr>
+            </w:r>
+            <w:r>
+              <w:rPr>
+                <w:noProof/>
+                <w:webHidden/>
+              </w:rPr>
+              <w:fldChar w:fldCharType="separate"/>
+            </w:r>
+            <w:r>
+              <w:rPr>
+                <w:noProof/>
+                <w:webHidden/>
+              </w:rPr>
+              <w:t>5</w:t>
+            </w:r>
+            <w:r>
+              <w:rPr>
+                <w:noProof/>
+                <w:webHidden/>
+              </w:rPr>
+              <w:fldChar w:fldCharType="end"/>
+            </w:r>
+          </w:hyperlink>
+        </w:p>
+        <w:p>
+          <w:pPr>
+            <w:pStyle w:val="TOC1"/>
+            <w:tabs>
+              <w:tab w:val="right" w:leader="dot" w:pos="9016"/>
+            </w:tabs>
+            <w:rPr>
+              <w:rFonts w:eastAsiaTheme="minorEastAsia"/>
+              <w:noProof/>
+              <w:sz w:val="24"/>
+              <w:szCs w:val="24"/>
+              <w:lang w:eastAsia="en-GB"/>
+            </w:rPr>
+          </w:pPr>
+          <w:hyperlink w:anchor="_Toc224815317" w:history="1">
+            <w:r>
+              <w:rPr>
+                <w:rStyle w:val="Hyperlink"/>
+                <w:noProof/>
+              </w:rPr>
+              <w:t>Noted Issues and Constraints</w:t>
+            </w:r>
+            <w:r>
+              <w:rPr>
+                <w:noProof/>
+                <w:webHidden/>
+              </w:rPr>
+              <w:tab/>
+            </w:r>
+            <w:r>
+              <w:rPr>
+                <w:noProof/>
+                <w:webHidden/>
+              </w:rPr>
+              <w:fldChar w:fldCharType="begin"/>
+            </w:r>
+            <w:r>
+              <w:rPr>
+                <w:noProof/>
+                <w:webHidden/>
+              </w:rPr>
+              <w:instrText xml:space="preserve"> PAGEREF _Toc224815317 \h </w:instrText>
+            </w:r>
+            <w:r>
+              <w:rPr>
+                <w:noProof/>
+                <w:webHidden/>
+              </w:rPr>
+            </w:r>
+            <w:r>
+              <w:rPr>
+                <w:noProof/>
+                <w:webHidden/>
+              </w:rPr>
+              <w:fldChar w:fldCharType="separate"/>
+            </w:r>
+            <w:r>
+              <w:rPr>
+                <w:noProof/>
+                <w:webHidden/>
+              </w:rPr>
+              <w:t>5</w:t>
             </w:r>
             <w:r>
               <w:rPr>
@@ -522,16 +827,20 @@
               <w:tab w:val="right" w:leader="dot" w:pos="9016"/>
             </w:tabs>
             <w:rPr>
+              <w:rFonts w:eastAsiaTheme="minorEastAsia"/>
               <w:noProof/>
+              <w:sz w:val="24"/>
+              <w:szCs w:val="24"/>
+              <w:lang w:eastAsia="en-GB"/>
             </w:rPr>
           </w:pPr>
-          <w:hyperlink w:anchor="_Toc222398040" w:history="1">
+          <w:hyperlink w:anchor="_Toc224815318" w:history="1">
             <w:r>
               <w:rPr>
                 <w:rStyle w:val="Hyperlink"/>
                 <w:noProof/>
               </w:rPr>
-              <w:t>Noted Issues and Constraints</w:t>
+              <w:t>Github Repository Link</w:t>
             </w:r>
             <w:r>
               <w:rPr>
@@ -552,7 +861,7 @@
                 <w:noProof/>
                 <w:webHidden/>
               </w:rPr>
-              <w:instrText xml:space="preserve"> PAGEREF _Toc222398040 \h </w:instrText>
+              <w:instrText xml:space="preserve"> PAGEREF _Toc224815318 \h </w:instrText>
             </w:r>
             <w:r>
               <w:rPr>
@@ -572,7 +881,7 @@
                 <w:noProof/>
                 <w:webHidden/>
               </w:rPr>
-              <w:t>3</w:t>
+              <w:t>6</w:t>
             </w:r>
             <w:r>
               <w:rPr>
@@ -590,16 +899,20 @@
               <w:tab w:val="right" w:leader="dot" w:pos="9016"/>
             </w:tabs>
             <w:rPr>
+              <w:rFonts w:eastAsiaTheme="minorEastAsia"/>
               <w:noProof/>
+              <w:sz w:val="24"/>
+              <w:szCs w:val="24"/>
+              <w:lang w:eastAsia="en-GB"/>
             </w:rPr>
           </w:pPr>
-          <w:hyperlink w:anchor="_Toc222398041" w:history="1">
+          <w:hyperlink w:anchor="_Toc224815319" w:history="1">
             <w:r>
               <w:rPr>
                 <w:rStyle w:val="Hyperlink"/>
                 <w:noProof/>
               </w:rPr>
-              <w:t>Github Repository Link</w:t>
+              <w:t>References</w:t>
             </w:r>
             <w:r>
               <w:rPr>
@@ -620,7 +933,7 @@
                 <w:noProof/>
                 <w:webHidden/>
               </w:rPr>
-              <w:instrText xml:space="preserve"> PAGEREF _Toc222398041 \h </w:instrText>
+              <w:instrText xml:space="preserve"> PAGEREF _Toc224815319 \h </w:instrText>
             </w:r>
             <w:r>
               <w:rPr>
@@ -640,75 +953,7 @@
                 <w:noProof/>
                 <w:webHidden/>
               </w:rPr>
-              <w:t>3</w:t>
-            </w:r>
-            <w:r>
-              <w:rPr>
-                <w:noProof/>
-                <w:webHidden/>
-              </w:rPr>
-              <w:fldChar w:fldCharType="end"/>
-            </w:r>
-          </w:hyperlink>
-        </w:p>
-        <w:p>
-          <w:pPr>
-            <w:pStyle w:val="TOC2"/>
-            <w:tabs>
-              <w:tab w:val="right" w:leader="dot" w:pos="9016"/>
-            </w:tabs>
-            <w:rPr>
-              <w:noProof/>
-            </w:rPr>
-          </w:pPr>
-          <w:hyperlink w:anchor="_Toc222398042" w:history="1">
-            <w:r>
-              <w:rPr>
-                <w:rStyle w:val="Hyperlink"/>
-                <w:noProof/>
-              </w:rPr>
-              <w:t>References</w:t>
-            </w:r>
-            <w:r>
-              <w:rPr>
-                <w:noProof/>
-                <w:webHidden/>
-              </w:rPr>
-              <w:tab/>
-            </w:r>
-            <w:r>
-              <w:rPr>
-                <w:noProof/>
-                <w:webHidden/>
-              </w:rPr>
-              <w:fldChar w:fldCharType="begin"/>
-            </w:r>
-            <w:r>
-              <w:rPr>
-                <w:noProof/>
-                <w:webHidden/>
-              </w:rPr>
-              <w:instrText xml:space="preserve"> PAGEREF _Toc222398042 \h </w:instrText>
-            </w:r>
-            <w:r>
-              <w:rPr>
-                <w:noProof/>
-                <w:webHidden/>
-              </w:rPr>
-            </w:r>
-            <w:r>
-              <w:rPr>
-                <w:noProof/>
-                <w:webHidden/>
-              </w:rPr>
-              <w:fldChar w:fldCharType="separate"/>
-            </w:r>
-            <w:r>
-              <w:rPr>
-                <w:noProof/>
-                <w:webHidden/>
-              </w:rPr>
-              <w:t>4</w:t>
+              <w:t>6</w:t>
             </w:r>
             <w:r>
               <w:rPr>
@@ -750,7 +995,7 @@
       <w:pPr>
         <w:pStyle w:val="Heading1"/>
       </w:pPr>
-      <w:bookmarkStart w:id="0" w:name="_Toc222398034"/>
+      <w:bookmarkStart w:id="0" w:name="_Toc224815308"/>
       <w:r>
         <w:lastRenderedPageBreak/>
         <w:t>Introduction</w:t>
@@ -841,7 +1086,7 @@
       <w:pPr>
         <w:pStyle w:val="Heading1"/>
       </w:pPr>
-      <w:bookmarkStart w:id="1" w:name="_Toc222398035"/>
+      <w:bookmarkStart w:id="1" w:name="_Toc224815309"/>
       <w:r>
         <w:t>Software Development Lifecycle</w:t>
       </w:r>
@@ -868,7 +1113,7 @@
       <w:pPr>
         <w:pStyle w:val="Heading1"/>
       </w:pPr>
-      <w:bookmarkStart w:id="2" w:name="_Toc222398036"/>
+      <w:bookmarkStart w:id="2" w:name="_Toc224815310"/>
       <w:r>
         <w:t>Design Document</w:t>
       </w:r>
@@ -883,14 +1128,13 @@
       <w:pPr>
         <w:pStyle w:val="Heading2"/>
       </w:pPr>
-      <w:bookmarkStart w:id="3" w:name="_Toc222398037"/>
+      <w:bookmarkStart w:id="3" w:name="_Toc224815311"/>
       <w:r>
         <w:t>Project Vision</w:t>
       </w:r>
       <w:bookmarkEnd w:id="3"/>
     </w:p>
     <w:p>
-      <w:bookmarkStart w:id="4" w:name="_Toc222398038"/>
       <w:r>
         <w:t>I will develop a notes application that will use the necessary encryption to ensure all notes will be stored securely and will be inaccessible by unauthorised users. It will give users a place to store sensitive data, such as passwords for other applications, or even data that they just want to keep a secret from others, such as present ideas. </w:t>
       </w:r>
@@ -903,7 +1147,10 @@
         <w:t>like</w:t>
       </w:r>
       <w:r>
-        <w:t xml:space="preserve"> my project. I will take some inspiration from them by letting users customise the app, but they will have less options like only changing the theme and font size of the app.</w:t>
+        <w:t xml:space="preserve"> my project. I will take some inspiration from them by letting users customise the app, but they will have less options like only changing the theme and font size of the app</w:t>
+      </w:r>
+      <w:r>
+        <w:t xml:space="preserve"> so the app is easier to navigate.</w:t>
       </w:r>
     </w:p>
     <w:p>
@@ -918,11 +1165,9 @@
       <w:r>
         <w:t>‘</w:t>
       </w:r>
-      <w:proofErr w:type="gramStart"/>
       <w:r>
         <w:t>preview</w:t>
       </w:r>
-      <w:proofErr w:type="gramEnd"/>
       <w:r>
         <w:t>’</w:t>
       </w:r>
@@ -934,46 +1179,155 @@
       <w:pPr>
         <w:pStyle w:val="Heading2"/>
       </w:pPr>
+      <w:bookmarkStart w:id="4" w:name="_Toc224815312"/>
       <w:r>
         <w:t>Background</w:t>
       </w:r>
       <w:bookmarkEnd w:id="4"/>
     </w:p>
     <w:p>
-      <w:r>
-        <w:t>Blah blah blah</w:t>
+      <w:pPr>
+        <w:tabs>
+          <w:tab w:val="center" w:pos="4513"/>
+        </w:tabs>
+      </w:pPr>
+      <w:r>
+        <w:t xml:space="preserve">Accessibility is </w:t>
+      </w:r>
+      <w:r>
+        <w:t>a key part of my website</w:t>
+      </w:r>
+      <w:r>
+        <w:t xml:space="preserve">, as it </w:t>
+      </w:r>
+      <w:r>
+        <w:t>makes it available to more people</w:t>
+      </w:r>
+      <w:r>
+        <w:t>, but it is also a legal requirement (</w:t>
+      </w:r>
+      <w:r>
+        <w:t>Legislation, 2018)</w:t>
       </w:r>
     </w:p>
     <w:p>
       <w:pPr>
         <w:pStyle w:val="Heading2"/>
       </w:pPr>
-      <w:bookmarkStart w:id="5" w:name="_Toc222398039"/>
+      <w:bookmarkStart w:id="5" w:name="_Toc224815313"/>
       <w:r>
         <w:lastRenderedPageBreak/>
-        <w:t xml:space="preserve">UML diagrams </w:t>
+        <w:t>UML diagrams</w:t>
       </w:r>
       <w:bookmarkEnd w:id="5"/>
-    </w:p>
-    <w:p>
-      <w:proofErr w:type="spellStart"/>
-      <w:r>
-        <w:t>Udfbhuafj</w:t>
-      </w:r>
-      <w:proofErr w:type="spellEnd"/>
+      <w:r>
+        <w:t xml:space="preserve"> </w:t>
+      </w:r>
+    </w:p>
+    <w:p>
+      <w:r>
+        <w:t>This section shows all the diagrams I have created to help the implementation of my website.</w:t>
+      </w:r>
     </w:p>
     <w:p>
       <w:pPr>
-        <w:pStyle w:val="Heading2"/>
+        <w:pStyle w:val="Heading3"/>
       </w:pPr>
+      <w:bookmarkStart w:id="6" w:name="_Toc224815314"/>
+      <w:r>
+        <w:t>Sitemap</w:t>
+      </w:r>
+      <w:bookmarkEnd w:id="6"/>
+    </w:p>
+    <w:p>
+      <w:r>
+        <w:t xml:space="preserve">This section shows the sitemap and how I expect my </w:t>
+      </w:r>
+      <w:r>
+        <w:t>single page application ‘pages’</w:t>
+      </w:r>
+      <w:r>
+        <w:t xml:space="preserve"> to be linked together.</w:t>
+      </w:r>
+    </w:p>
+    <w:p>
+      <w:r>
+        <w:rPr>
+          <w:noProof/>
+        </w:rPr>
+        <w:drawing>
+          <wp:inline distT="0" distB="0" distL="0" distR="0" wp14:anchorId="24F24067" wp14:editId="6C698AA1">
+            <wp:extent cx="5067300" cy="3646212"/>
+            <wp:effectExtent l="0" t="0" r="0" b="0"/>
+            <wp:docPr id="1691180801" name="Picture 2"/>
+            <wp:cNvGraphicFramePr>
+              <a:graphicFrameLocks xmlns:a="http://schemas.openxmlformats.org/drawingml/2006/main" noChangeAspect="1"/>
+            </wp:cNvGraphicFramePr>
+            <a:graphic xmlns:a="http://schemas.openxmlformats.org/drawingml/2006/main">
+              <a:graphicData uri="http://schemas.openxmlformats.org/drawingml/2006/picture">
+                <pic:pic xmlns:pic="http://schemas.openxmlformats.org/drawingml/2006/picture">
+                  <pic:nvPicPr>
+                    <pic:cNvPr id="0" name="Picture 1"/>
+                    <pic:cNvPicPr>
+                      <a:picLocks noChangeAspect="1" noChangeArrowheads="1"/>
+                    </pic:cNvPicPr>
+                  </pic:nvPicPr>
+                  <pic:blipFill>
+                    <a:blip r:embed="rId5" cstate="print">
+                      <a:extLst>
+                        <a:ext uri="{28A0092B-C50C-407E-A947-70E740481C1C}">
+                          <a14:useLocalDpi xmlns:a14="http://schemas.microsoft.com/office/drawing/2010/main" val="0"/>
+                        </a:ext>
+                      </a:extLst>
+                    </a:blip>
+                    <a:srcRect/>
+                    <a:stretch>
+                      <a:fillRect/>
+                    </a:stretch>
+                  </pic:blipFill>
+                  <pic:spPr bwMode="auto">
+                    <a:xfrm>
+                      <a:off x="0" y="0"/>
+                      <a:ext cx="5067300" cy="3646212"/>
+                    </a:xfrm>
+                    <a:prstGeom prst="rect">
+                      <a:avLst/>
+                    </a:prstGeom>
+                    <a:noFill/>
+                    <a:ln>
+                      <a:noFill/>
+                    </a:ln>
+                  </pic:spPr>
+                </pic:pic>
+              </a:graphicData>
+            </a:graphic>
+          </wp:inline>
+        </w:drawing>
+      </w:r>
     </w:p>
     <w:p>
       <w:pPr>
-        <w:pStyle w:val="Heading2"/>
+        <w:rPr>
+          <w:rFonts w:eastAsiaTheme="majorEastAsia" w:cstheme="majorBidi"/>
+          <w:color w:val="0F4761" w:themeColor="accent1" w:themeShade="BF"/>
+          <w:sz w:val="28"/>
+          <w:szCs w:val="28"/>
+        </w:rPr>
       </w:pPr>
       <w:r>
+        <w:br w:type="page"/>
+      </w:r>
+    </w:p>
+    <w:p>
+      <w:pPr>
+        <w:pStyle w:val="Heading3"/>
+      </w:pPr>
+      <w:bookmarkStart w:id="7" w:name="_Toc224815315"/>
+      <w:r>
+        <w:lastRenderedPageBreak/>
         <w:t>Wireframes</w:t>
       </w:r>
+      <w:bookmarkEnd w:id="7"/>
     </w:p>
     <w:p>
       <w:r>
@@ -984,6 +1338,73 @@
       </w:r>
     </w:p>
     <w:p>
+      <w:r>
+        <w:rPr>
+          <w:noProof/>
+        </w:rPr>
+        <w:drawing>
+          <wp:anchor distT="0" distB="0" distL="360045" distR="360045" simplePos="0" relativeHeight="251660288" behindDoc="0" locked="0" layoutInCell="1" allowOverlap="1" wp14:anchorId="3EAA9C69" wp14:editId="4EFD4ECA">
+            <wp:simplePos x="0" y="0"/>
+            <wp:positionH relativeFrom="column">
+              <wp:posOffset>3138805</wp:posOffset>
+            </wp:positionH>
+            <wp:positionV relativeFrom="paragraph">
+              <wp:posOffset>238760</wp:posOffset>
+            </wp:positionV>
+            <wp:extent cx="3101340" cy="1860550"/>
+            <wp:effectExtent l="0" t="0" r="3810" b="6350"/>
+            <wp:wrapSquare wrapText="bothSides"/>
+            <wp:docPr id="363856078" name="Picture 2"/>
+            <wp:cNvGraphicFramePr>
+              <a:graphicFrameLocks xmlns:a="http://schemas.openxmlformats.org/drawingml/2006/main" noChangeAspect="1"/>
+            </wp:cNvGraphicFramePr>
+            <a:graphic xmlns:a="http://schemas.openxmlformats.org/drawingml/2006/main">
+              <a:graphicData uri="http://schemas.openxmlformats.org/drawingml/2006/picture">
+                <pic:pic xmlns:pic="http://schemas.openxmlformats.org/drawingml/2006/picture">
+                  <pic:nvPicPr>
+                    <pic:cNvPr id="0" name="Picture 3"/>
+                    <pic:cNvPicPr>
+                      <a:picLocks noChangeAspect="1" noChangeArrowheads="1"/>
+                    </pic:cNvPicPr>
+                  </pic:nvPicPr>
+                  <pic:blipFill>
+                    <a:blip r:embed="rId6" cstate="print">
+                      <a:extLst>
+                        <a:ext uri="{28A0092B-C50C-407E-A947-70E740481C1C}">
+                          <a14:useLocalDpi xmlns:a14="http://schemas.microsoft.com/office/drawing/2010/main" val="0"/>
+                        </a:ext>
+                      </a:extLst>
+                    </a:blip>
+                    <a:srcRect/>
+                    <a:stretch>
+                      <a:fillRect/>
+                    </a:stretch>
+                  </pic:blipFill>
+                  <pic:spPr bwMode="auto">
+                    <a:xfrm>
+                      <a:off x="0" y="0"/>
+                      <a:ext cx="3101340" cy="1860550"/>
+                    </a:xfrm>
+                    <a:prstGeom prst="rect">
+                      <a:avLst/>
+                    </a:prstGeom>
+                    <a:noFill/>
+                    <a:ln>
+                      <a:noFill/>
+                    </a:ln>
+                  </pic:spPr>
+                </pic:pic>
+              </a:graphicData>
+            </a:graphic>
+            <wp14:sizeRelH relativeFrom="margin">
+              <wp14:pctWidth>0</wp14:pctWidth>
+            </wp14:sizeRelH>
+            <wp14:sizeRelV relativeFrom="margin">
+              <wp14:pctHeight>0</wp14:pctHeight>
+            </wp14:sizeRelV>
+          </wp:anchor>
+        </w:drawing>
+      </w:r>
       <w:r>
         <w:rPr>
           <w:noProof/>
@@ -991,28 +1412,28 @@
         <mc:AlternateContent>
           <mc:Choice Requires="wpi">
             <w:drawing>
-              <wp:anchor distT="0" distB="0" distL="114300" distR="114300" simplePos="0" relativeHeight="251669504" behindDoc="0" locked="0" layoutInCell="1" allowOverlap="1" wp14:anchorId="1204D359" wp14:editId="20EA84CE">
+              <wp:anchor distT="0" distB="0" distL="114300" distR="114300" simplePos="0" relativeHeight="251669504" behindDoc="0" locked="0" layoutInCell="1" allowOverlap="1" wp14:anchorId="1204D359" wp14:editId="793AE912">
                 <wp:simplePos x="0" y="0"/>
                 <wp:positionH relativeFrom="column">
-                  <wp:posOffset>1454785</wp:posOffset>
+                  <wp:posOffset>1283335</wp:posOffset>
                 </wp:positionH>
                 <wp:positionV relativeFrom="paragraph">
-                  <wp:posOffset>1393190</wp:posOffset>
+                  <wp:posOffset>1216659</wp:posOffset>
                 </wp:positionV>
-                <wp:extent cx="2473104" cy="349195"/>
-                <wp:effectExtent l="38100" t="38100" r="41910" b="32385"/>
+                <wp:extent cx="2025015" cy="398145"/>
+                <wp:effectExtent l="38100" t="38100" r="32385" b="40005"/>
                 <wp:wrapNone/>
                 <wp:docPr id="1269398004" name="Ink 18"/>
                 <wp:cNvGraphicFramePr/>
                 <a:graphic xmlns:a="http://schemas.openxmlformats.org/drawingml/2006/main">
                   <a:graphicData uri="http://schemas.microsoft.com/office/word/2010/wordprocessingInk">
-                    <w14:contentPart bwMode="auto" r:id="rId5">
+                    <w14:contentPart bwMode="auto" r:id="rId7">
                       <w14:nvContentPartPr>
                         <w14:cNvContentPartPr/>
                       </w14:nvContentPartPr>
                       <w14:xfrm flipV="1">
                         <a:off x="0" y="0"/>
-                        <a:ext cx="2473104" cy="349195"/>
+                        <a:ext cx="2025015" cy="398145"/>
                       </w14:xfrm>
                     </w14:contentPart>
                   </a:graphicData>
@@ -1028,7 +1449,7 @@
           </mc:Choice>
           <mc:Fallback>
             <w:pict>
-              <v:shapetype w14:anchorId="1B251AF3" id="_x0000_t75" coordsize="21600,21600" o:spt="75" o:preferrelative="t" path="m@4@5l@4@11@9@11@9@5xe" filled="f" stroked="f">
+              <v:shapetype w14:anchorId="212D7CA0" id="_x0000_t75" coordsize="21600,21600" o:spt="75" o:preferrelative="t" path="m@4@5l@4@11@9@11@9@5xe" filled="f" stroked="f">
                 <v:stroke joinstyle="miter"/>
                 <v:formulas>
                   <v:f eqn="if lineDrawn pixelLineWidth 0"/>
@@ -1047,8 +1468,8 @@
                 <v:path o:extrusionok="f" gradientshapeok="t" o:connecttype="rect"/>
                 <o:lock v:ext="edit" aspectratio="t"/>
               </v:shapetype>
-              <v:shape id="Ink 18" o:spid="_x0000_s1026" type="#_x0000_t75" style="position:absolute;margin-left:114.2pt;margin-top:109.35pt;width:195.45pt;height:28.2pt;flip:y;z-index:251669504;visibility:visible;mso-wrap-style:square;mso-width-percent:0;mso-height-percent:0;mso-wrap-distance-left:9pt;mso-wrap-distance-top:0;mso-wrap-distance-right:9pt;mso-wrap-distance-bottom:0;mso-position-horizontal:absolute;mso-position-horizontal-relative:text;mso-position-vertical:absolute;mso-position-vertical-relative:text;mso-width-percent:0;mso-height-percent:0;mso-width-relative:margin;mso-height-relative:margin" o:gfxdata="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">
-                <v:imagedata r:id="rId6" o:title=""/>
+              <v:shape id="Ink 18" o:spid="_x0000_s1026" type="#_x0000_t75" style="position:absolute;margin-left:100.7pt;margin-top:95.45pt;width:160.15pt;height:32.05pt;flip:y;z-index:251669504;visibility:visible;mso-wrap-style:square;mso-width-percent:0;mso-height-percent:0;mso-wrap-distance-left:9pt;mso-wrap-distance-top:0;mso-wrap-distance-right:9pt;mso-wrap-distance-bottom:0;mso-position-horizontal:absolute;mso-position-horizontal-relative:text;mso-position-vertical:absolute;mso-position-vertical-relative:text;mso-width-percent:0;mso-height-percent:0;mso-width-relative:margin;mso-height-relative:margin" o:gfxdata="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">
+                <v:imagedata r:id="rId8" o:title=""/>
               </v:shape>
             </w:pict>
           </mc:Fallback>
@@ -1171,7 +1592,7 @@
                     </pic:cNvPicPr>
                   </pic:nvPicPr>
                   <pic:blipFill>
-                    <a:blip r:embed="rId7" cstate="print">
+                    <a:blip r:embed="rId9" cstate="print">
                       <a:extLst>
                         <a:ext uri="{28A0092B-C50C-407E-A947-70E740481C1C}">
                           <a14:useLocalDpi xmlns:a14="http://schemas.microsoft.com/office/drawing/2010/main" val="0"/>
@@ -1215,7 +1636,7 @@
         <mc:AlternateContent>
           <mc:Choice Requires="wpi">
             <w:drawing>
-              <wp:anchor distT="0" distB="0" distL="114300" distR="114300" simplePos="0" relativeHeight="251662336" behindDoc="0" locked="0" layoutInCell="1" allowOverlap="1" wp14:anchorId="30D22623" wp14:editId="7C123B0B">
+              <wp:anchor distT="0" distB="0" distL="114300" distR="114300" simplePos="0" relativeHeight="251662336" behindDoc="0" locked="0" layoutInCell="1" allowOverlap="1" wp14:anchorId="30D22623" wp14:editId="10B242D3">
                 <wp:simplePos x="0" y="0"/>
                 <wp:positionH relativeFrom="column">
                   <wp:posOffset>1375560</wp:posOffset>
@@ -1230,7 +1651,7 @@
                 <wp:cNvGraphicFramePr/>
                 <a:graphic xmlns:a="http://schemas.openxmlformats.org/drawingml/2006/main">
                   <a:graphicData uri="http://schemas.microsoft.com/office/word/2010/wordprocessingInk">
-                    <w14:contentPart bwMode="auto" r:id="rId8">
+                    <w14:contentPart bwMode="auto" r:id="rId10">
                       <w14:nvContentPartPr>
                         <w14:cNvContentPartPr/>
                       </w14:nvContentPartPr>
@@ -1246,28 +1667,89 @@
           </mc:Choice>
           <mc:Fallback>
             <w:pict>
-              <v:shape w14:anchorId="16D5FEC5" id="Ink 11" o:spid="_x0000_s1026" type="#_x0000_t75" style="position:absolute;margin-left:107.95pt;margin-top:135.9pt;width:.75pt;height:.75pt;z-index:251662336;visibility:visible;mso-wrap-style:square;mso-wrap-distance-left:9pt;mso-wrap-distance-top:0;mso-wrap-distance-right:9pt;mso-wrap-distance-bottom:0;mso-position-horizontal:absolute;mso-position-horizontal-relative:text;mso-position-vertical:absolute;mso-position-vertical-relative:text" o:gfxdata="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">
-                <v:imagedata r:id="rId9" o:title=""/>
+              <v:shape w14:anchorId="1FD266B5" id="Ink 11" o:spid="_x0000_s1026" type="#_x0000_t75" style="position:absolute;margin-left:107.95pt;margin-top:135.9pt;width:.75pt;height:.75pt;z-index:251662336;visibility:visible;mso-wrap-style:square;mso-wrap-distance-left:9pt;mso-wrap-distance-top:0;mso-wrap-distance-right:9pt;mso-wrap-distance-bottom:0;mso-position-horizontal:absolute;mso-position-horizontal-relative:text;mso-position-vertical:absolute;mso-position-vertical-relative:text" o:gfxdata="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">
+                <v:imagedata r:id="rId11" o:title=""/>
               </v:shape>
             </w:pict>
           </mc:Fallback>
         </mc:AlternateContent>
       </w:r>
       <w:r>
+        <w:t xml:space="preserve"> </w:t>
+      </w:r>
+    </w:p>
+    <w:bookmarkStart w:id="8" w:name="_Toc224815316"/>
+    <w:p>
+      <w:pPr>
+        <w:pStyle w:val="Heading1"/>
+      </w:pPr>
+      <w:r>
+        <w:rPr>
+          <w:noProof/>
+        </w:rPr>
+        <mc:AlternateContent>
+          <mc:Choice Requires="wpi">
+            <w:drawing>
+              <wp:anchor distT="0" distB="0" distL="114300" distR="114300" simplePos="0" relativeHeight="251671552" behindDoc="0" locked="0" layoutInCell="1" allowOverlap="1" wp14:anchorId="3E3D77BC" wp14:editId="5470C8F1">
+                <wp:simplePos x="0" y="0"/>
+                <wp:positionH relativeFrom="margin">
+                  <wp:posOffset>1409700</wp:posOffset>
+                </wp:positionH>
+                <wp:positionV relativeFrom="paragraph">
+                  <wp:posOffset>1444985</wp:posOffset>
+                </wp:positionV>
+                <wp:extent cx="1028700" cy="977900"/>
+                <wp:effectExtent l="38100" t="38100" r="38100" b="50800"/>
+                <wp:wrapNone/>
+                <wp:docPr id="169102763" name="Ink 18"/>
+                <wp:cNvGraphicFramePr/>
+                <a:graphic xmlns:a="http://schemas.openxmlformats.org/drawingml/2006/main">
+                  <a:graphicData uri="http://schemas.microsoft.com/office/word/2010/wordprocessingInk">
+                    <w14:contentPart bwMode="auto" r:id="rId12">
+                      <w14:nvContentPartPr>
+                        <w14:cNvContentPartPr/>
+                      </w14:nvContentPartPr>
+                      <w14:xfrm>
+                        <a:off x="0" y="0"/>
+                        <a:ext cx="1028700" cy="977900"/>
+                      </w14:xfrm>
+                    </w14:contentPart>
+                  </a:graphicData>
+                </a:graphic>
+                <wp14:sizeRelH relativeFrom="margin">
+                  <wp14:pctWidth>0</wp14:pctWidth>
+                </wp14:sizeRelH>
+                <wp14:sizeRelV relativeFrom="margin">
+                  <wp14:pctHeight>0</wp14:pctHeight>
+                </wp14:sizeRelV>
+              </wp:anchor>
+            </w:drawing>
+          </mc:Choice>
+          <mc:Fallback>
+            <w:pict>
+              <v:shape w14:anchorId="2E957A81" id="Ink 18" o:spid="_x0000_s1026" type="#_x0000_t75" style="position:absolute;margin-left:110.65pt;margin-top:113.45pt;width:81.7pt;height:77.7pt;z-index:251671552;visibility:visible;mso-wrap-style:square;mso-width-percent:0;mso-height-percent:0;mso-wrap-distance-left:9pt;mso-wrap-distance-top:0;mso-wrap-distance-right:9pt;mso-wrap-distance-bottom:0;mso-position-horizontal:absolute;mso-position-horizontal-relative:margin;mso-position-vertical:absolute;mso-position-vertical-relative:text;mso-width-percent:0;mso-height-percent:0;mso-width-relative:margin;mso-height-relative:margin" o:gfxdata="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">
+                <v:imagedata r:id="rId13" o:title=""/>
+                <w10:wrap anchorx="margin"/>
+              </v:shape>
+            </w:pict>
+          </mc:Fallback>
+        </mc:AlternateContent>
+      </w:r>
+      <w:r>
         <w:rPr>
           <w:noProof/>
         </w:rPr>
         <w:drawing>
-          <wp:anchor distT="0" distB="0" distL="114300" distR="114300" simplePos="0" relativeHeight="251659264" behindDoc="0" locked="0" layoutInCell="1" allowOverlap="1" wp14:anchorId="6A5B16E6" wp14:editId="7467EC1D">
+          <wp:anchor distT="0" distB="0" distL="114300" distR="114300" simplePos="0" relativeHeight="251659264" behindDoc="0" locked="0" layoutInCell="1" allowOverlap="1" wp14:anchorId="6A5B16E6" wp14:editId="72E58E20">
             <wp:simplePos x="0" y="0"/>
             <wp:positionH relativeFrom="margin">
-              <wp:posOffset>2806700</wp:posOffset>
+              <wp:align>center</wp:align>
             </wp:positionH>
             <wp:positionV relativeFrom="paragraph">
-              <wp:posOffset>171450</wp:posOffset>
+              <wp:posOffset>1951355</wp:posOffset>
             </wp:positionV>
-            <wp:extent cx="3235325" cy="1939925"/>
-            <wp:effectExtent l="0" t="0" r="3175" b="3175"/>
+            <wp:extent cx="3139440" cy="1882775"/>
+            <wp:effectExtent l="0" t="0" r="3810" b="3175"/>
             <wp:wrapSquare wrapText="bothSides"/>
             <wp:docPr id="1429896336" name="Picture 3"/>
             <wp:cNvGraphicFramePr>
@@ -1283,7 +1765,7 @@
                     </pic:cNvPicPr>
                   </pic:nvPicPr>
                   <pic:blipFill>
-                    <a:blip r:embed="rId10" cstate="print">
+                    <a:blip r:embed="rId14" cstate="print">
                       <a:extLst>
                         <a:ext uri="{28A0092B-C50C-407E-A947-70E740481C1C}">
                           <a14:useLocalDpi xmlns:a14="http://schemas.microsoft.com/office/drawing/2010/main" val="0"/>
@@ -1298,7 +1780,7 @@
                   <pic:spPr bwMode="auto">
                     <a:xfrm>
                       <a:off x="0" y="0"/>
-                      <a:ext cx="3235325" cy="1939925"/>
+                      <a:ext cx="3139440" cy="1882775"/>
                     </a:xfrm>
                     <a:prstGeom prst="rect">
                       <a:avLst/>
@@ -1320,32 +1802,76 @@
           </wp:anchor>
         </w:drawing>
       </w:r>
-      <w:r>
-        <w:t xml:space="preserve"> </w:t>
-      </w:r>
+      <w:bookmarkEnd w:id="8"/>
     </w:p>
     <w:p>
       <w:pPr>
         <w:pStyle w:val="Heading1"/>
       </w:pPr>
-      <w:bookmarkStart w:id="6" w:name="_Toc222398040"/>
+    </w:p>
+    <w:p>
+      <w:pPr>
+        <w:pStyle w:val="Heading1"/>
+      </w:pPr>
+    </w:p>
+    <w:p/>
+    <w:p/>
+    <w:p>
+      <w:pPr>
+        <w:rPr>
+          <w:rFonts w:eastAsiaTheme="majorEastAsia" w:cstheme="majorBidi"/>
+          <w:color w:val="0F4761" w:themeColor="accent1" w:themeShade="BF"/>
+          <w:sz w:val="28"/>
+          <w:szCs w:val="28"/>
+        </w:rPr>
+      </w:pPr>
+      <w:r>
+        <w:br w:type="page"/>
+      </w:r>
+    </w:p>
+    <w:p>
+      <w:pPr>
+        <w:pStyle w:val="Heading3"/>
+      </w:pPr>
+      <w:r>
+        <w:lastRenderedPageBreak/>
+        <w:t>Sequence Diagrams</w:t>
+      </w:r>
+    </w:p>
+    <w:p>
+      <w:r>
+        <w:t>This section is where I will show all my sequence diagrams.</w:t>
+      </w:r>
+    </w:p>
+    <w:p>
+      <w:pPr>
+        <w:pStyle w:val="Heading4"/>
+      </w:pPr>
+      <w:r>
+        <w:t>Log in sequence</w:t>
+      </w:r>
+    </w:p>
+    <w:p>
+      <w:r>
+        <w:t xml:space="preserve">This diagram shows how a user, once they have input their username and password </w:t>
+      </w:r>
+      <w:r>
+        <w:t>and clicked the log in button, wi</w:t>
+      </w:r>
+      <w:r>
+        <w:t>ll be validated against the stored data.</w:t>
+      </w:r>
+    </w:p>
+    <w:p>
       <w:r>
         <w:rPr>
           <w:noProof/>
         </w:rPr>
         <w:drawing>
-          <wp:anchor distT="0" distB="0" distL="360045" distR="360045" simplePos="0" relativeHeight="251660288" behindDoc="0" locked="0" layoutInCell="1" allowOverlap="1" wp14:anchorId="3EAA9C69" wp14:editId="2493CD70">
-            <wp:simplePos x="0" y="0"/>
-            <wp:positionH relativeFrom="column">
-              <wp:posOffset>523047</wp:posOffset>
-            </wp:positionH>
-            <wp:positionV relativeFrom="paragraph">
-              <wp:posOffset>2086223</wp:posOffset>
-            </wp:positionV>
-            <wp:extent cx="4255200" cy="2552400"/>
+          <wp:inline distT="0" distB="0" distL="0" distR="0" wp14:anchorId="2634A18D" wp14:editId="210FE257">
+            <wp:extent cx="4006850" cy="4006850"/>
             <wp:effectExtent l="0" t="0" r="0" b="0"/>
-            <wp:wrapSquare wrapText="bothSides"/>
-            <wp:docPr id="363856078" name="Picture 2"/>
+            <wp:docPr id="866947746" name="Picture 3"/>
             <wp:cNvGraphicFramePr>
               <a:graphicFrameLocks xmlns:a="http://schemas.openxmlformats.org/drawingml/2006/main" noChangeAspect="1"/>
             </wp:cNvGraphicFramePr>
@@ -1359,7 +1885,7 @@
                     </pic:cNvPicPr>
                   </pic:nvPicPr>
                   <pic:blipFill>
-                    <a:blip r:embed="rId11" cstate="print">
+                    <a:blip r:embed="rId15" cstate="print">
                       <a:extLst>
                         <a:ext uri="{28A0092B-C50C-407E-A947-70E740481C1C}">
                           <a14:useLocalDpi xmlns:a14="http://schemas.microsoft.com/office/drawing/2010/main" val="0"/>
@@ -1374,7 +1900,7 @@
                   <pic:spPr bwMode="auto">
                     <a:xfrm>
                       <a:off x="0" y="0"/>
-                      <a:ext cx="4255200" cy="2552400"/>
+                      <a:ext cx="4006850" cy="4006850"/>
                     </a:xfrm>
                     <a:prstGeom prst="rect">
                       <a:avLst/>
@@ -1387,13 +1913,7 @@
                 </pic:pic>
               </a:graphicData>
             </a:graphic>
-            <wp14:sizeRelH relativeFrom="margin">
-              <wp14:pctWidth>0</wp14:pctWidth>
-            </wp14:sizeRelH>
-            <wp14:sizeRelV relativeFrom="margin">
-              <wp14:pctHeight>0</wp14:pctHeight>
-            </wp14:sizeRelV>
-          </wp:anchor>
+          </wp:inline>
         </w:drawing>
       </w:r>
     </w:p>
@@ -1401,34 +1921,15 @@
       <w:pPr>
         <w:pStyle w:val="Heading1"/>
       </w:pPr>
-    </w:p>
-    <w:p>
-      <w:pPr>
-        <w:pStyle w:val="Heading1"/>
-      </w:pPr>
-    </w:p>
-    <w:p>
-      <w:pPr>
-        <w:pStyle w:val="Heading1"/>
-      </w:pPr>
-    </w:p>
-    <w:p>
-      <w:pPr>
-        <w:pStyle w:val="Heading1"/>
-      </w:pPr>
-    </w:p>
-    <w:p>
-      <w:pPr>
-        <w:pStyle w:val="Heading1"/>
-      </w:pPr>
+      <w:bookmarkStart w:id="9" w:name="_Toc224815317"/>
       <w:r>
         <w:t>Noted Issues and Constraints</w:t>
       </w:r>
-      <w:bookmarkEnd w:id="6"/>
-    </w:p>
-    <w:p>
-      <w:r>
-        <w:t xml:space="preserve">One issues I encountered during this project was </w:t>
+      <w:bookmarkEnd w:id="9"/>
+    </w:p>
+    <w:p>
+      <w:r>
+        <w:t xml:space="preserve">One issue I encountered during this project was </w:t>
       </w:r>
       <w:r>
         <w:t xml:space="preserve">due to the constraints given by the allowed technologies list, as well as my limited understanding of node.js and its crypto module. </w:t>
@@ -1479,7 +1980,13 @@
         <w:t xml:space="preserve">fy </w:t>
       </w:r>
       <w:r>
-        <w:t xml:space="preserve">library </w:t>
+        <w:t>library</w:t>
+      </w:r>
+      <w:r>
+        <w:t xml:space="preserve"> (ljharb, 2024)</w:t>
+      </w:r>
+      <w:r>
+        <w:t xml:space="preserve"> </w:t>
       </w:r>
       <w:r>
         <w:t xml:space="preserve">which </w:t>
@@ -1500,25 +2007,75 @@
         <w:t xml:space="preserve"> I could not use it due to it not being on the allowed technologies list. In the end I decided to imp</w:t>
       </w:r>
       <w:r>
-        <w:t xml:space="preserve">lement my </w:t>
+        <w:t>lement my security with my own encryption and hashing algorithms which means the project is not as secure as I’d like</w:t>
+      </w:r>
+      <w:r>
+        <w:t>, but at least it has some security implemented.</w:t>
+      </w:r>
+    </w:p>
+    <w:p>
+      <w:r>
+        <w:t xml:space="preserve">Another issue I encountered </w:t>
+      </w:r>
+      <w:r>
+        <w:t>was time management. Alongside this project I also had 2 other pieces of coursework due within a week of this one’s due date</w:t>
+      </w:r>
+      <w:r>
+        <w:t>. I had to try and balance my focus of all 3 coursework</w:t>
+      </w:r>
+      <w:r>
+        <w:t xml:space="preserve">, however I preferred this coursework as it includes programming </w:t>
+      </w:r>
+      <w:r>
+        <w:t>and I enjoy that</w:t>
+      </w:r>
+      <w:r>
+        <w:t>,</w:t>
+      </w:r>
+      <w:r>
+        <w:t xml:space="preserve"> so I tended to focus on this more than the other ones. </w:t>
+      </w:r>
+      <w:r>
+        <w:t xml:space="preserve"> </w:t>
+      </w:r>
+      <w:r>
+        <w:t xml:space="preserve">As a consequence of this, I </w:t>
+      </w:r>
+      <w:r>
+        <w:t xml:space="preserve">fell </w:t>
       </w:r>
       <w:r>
         <w:lastRenderedPageBreak/>
-        <w:t>security with my own encryption and hashing algorithms which means the project is not as secure as I’d like</w:t>
-      </w:r>
-      <w:r>
-        <w:t>, but at least it has some security implemented.</w:t>
+        <w:t xml:space="preserve">behind on </w:t>
+      </w:r>
+      <w:r>
+        <w:t xml:space="preserve">those two coursework and to fix this I had to set some days aside where I ignored this coursework to focus on the others. </w:t>
+      </w:r>
+      <w:r>
+        <w:t>I also worked for 2 weeks over the easter holidays</w:t>
+      </w:r>
+      <w:r>
+        <w:t>, which meant my sprint during that time was very dialled back and I</w:t>
+      </w:r>
+      <w:r>
+        <w:t xml:space="preserve"> could not </w:t>
+      </w:r>
+      <w:r>
+        <w:t>complete much</w:t>
+      </w:r>
+      <w:r>
+        <w:t>, so the next sprints ended up having more to do.</w:t>
       </w:r>
     </w:p>
     <w:p>
       <w:pPr>
         <w:pStyle w:val="Heading2"/>
       </w:pPr>
-      <w:bookmarkStart w:id="7" w:name="_Toc222398041"/>
+      <w:bookmarkStart w:id="10" w:name="_Toc224815318"/>
       <w:r>
         <w:t>Github Repository Link</w:t>
       </w:r>
-      <w:bookmarkEnd w:id="7"/>
+      <w:bookmarkEnd w:id="10"/>
     </w:p>
     <w:p>
       <w:r>
@@ -1529,15 +2086,96 @@
       <w:pPr>
         <w:pStyle w:val="Heading2"/>
       </w:pPr>
-      <w:bookmarkStart w:id="8" w:name="_Toc222398042"/>
+      <w:bookmarkStart w:id="11" w:name="_Toc224815319"/>
       <w:r>
         <w:t>References</w:t>
       </w:r>
-      <w:bookmarkEnd w:id="8"/>
-    </w:p>
-    <w:p>
-      <w:r>
-        <w:t>Blah blah blah</w:t>
+      <w:bookmarkEnd w:id="11"/>
+    </w:p>
+    <w:p>
+      <w:r>
+        <w:t>L</w:t>
+      </w:r>
+      <w:r>
+        <w:t>jharb</w:t>
+      </w:r>
+      <w:r>
+        <w:t xml:space="preserve"> (2024) </w:t>
+      </w:r>
+      <w:r>
+        <w:rPr>
+          <w:i/>
+          <w:iCs/>
+        </w:rPr>
+        <w:t>Browserify / crypto-browserify</w:t>
+      </w:r>
+      <w:r>
+        <w:rPr>
+          <w:i/>
+          <w:iCs/>
+        </w:rPr>
+        <w:t>.</w:t>
+      </w:r>
+      <w:r>
+        <w:rPr>
+          <w:i/>
+          <w:iCs/>
+        </w:rPr>
+        <w:t xml:space="preserve"> </w:t>
+      </w:r>
+      <w:r>
+        <w:t>Available at:</w:t>
+      </w:r>
+      <w:r>
+        <w:t xml:space="preserve"> </w:t>
+      </w:r>
+      <w:hyperlink r:id="rId16" w:history="1">
+        <w:r>
+          <w:rPr>
+            <w:rStyle w:val="Hyperlink"/>
+          </w:rPr>
+          <w:t>https://github.com/browserify/crypto-browserify</w:t>
+        </w:r>
+      </w:hyperlink>
+      <w:r>
+        <w:t xml:space="preserve"> (Accessed: 19/03/2026)</w:t>
+      </w:r>
+    </w:p>
+    <w:p>
+      <w:r>
+        <w:t xml:space="preserve">Legislation (2025) </w:t>
+      </w:r>
+      <w:r>
+        <w:rPr>
+          <w:i/>
+        </w:rPr>
+        <w:t>The Public Sector Bodies (Websites and Mobile Applications) (No. 2) Accessibility Regulations 2018</w:t>
+      </w:r>
+      <w:r>
+        <w:rPr>
+          <w:i/>
+        </w:rPr>
+        <w:t>.</w:t>
+      </w:r>
+      <w:r>
+        <w:t xml:space="preserve"> </w:t>
+      </w:r>
+      <w:r>
+        <w:t xml:space="preserve">Available at: </w:t>
+      </w:r>
+      <w:hyperlink r:id="rId17" w:history="1">
+        <w:r>
+          <w:rPr>
+            <w:rStyle w:val="Hyperlink"/>
+          </w:rPr>
+          <w:t>https://www.legislation.gov.uk/uksi/2018/952/contents</w:t>
+        </w:r>
+      </w:hyperlink>
+      <w:r>
+        <w:t xml:space="preserve"> </w:t>
+      </w:r>
+      <w:r>
+        <w:t>(Accessed: 19/03/2026)</w:t>
       </w:r>
     </w:p>
     <w:sectPr>
@@ -2000,7 +2638,6 @@
     <w:next w:val="Normal"/>
     <w:link w:val="Heading3Char"/>
     <w:uiPriority w:val="9"/>
-    <w:semiHidden/>
     <w:unhideWhenUsed/>
     <w:qFormat/>
     <w:rsid w:val="00A36231"/>
@@ -2023,7 +2660,6 @@
     <w:next w:val="Normal"/>
     <w:link w:val="Heading4Char"/>
     <w:uiPriority w:val="9"/>
-    <w:semiHidden/>
     <w:unhideWhenUsed/>
     <w:qFormat/>
     <w:rsid w:val="00A36231"/>
@@ -2152,7 +2788,6 @@
   <w:style w:type="character" w:default="1" w:styleId="DefaultParagraphFont">
     <w:name w:val="Default Paragraph Font"/>
     <w:uiPriority w:val="1"/>
-    <w:semiHidden/>
     <w:unhideWhenUsed/>
   </w:style>
   <w:style w:type="table" w:default="1" w:styleId="TableNormal">
@@ -2207,7 +2842,6 @@
     <w:basedOn w:val="DefaultParagraphFont"/>
     <w:link w:val="Heading3"/>
     <w:uiPriority w:val="9"/>
-    <w:semiHidden/>
     <w:rsid w:val="00A36231"/>
     <w:rPr>
       <w:rFonts w:eastAsiaTheme="majorEastAsia" w:cstheme="majorBidi"/>
@@ -2221,7 +2855,6 @@
     <w:basedOn w:val="DefaultParagraphFont"/>
     <w:link w:val="Heading4"/>
     <w:uiPriority w:val="9"/>
-    <w:semiHidden/>
     <w:rsid w:val="00A36231"/>
     <w:rPr>
       <w:rFonts w:eastAsiaTheme="majorEastAsia" w:cstheme="majorBidi"/>
@@ -2520,6 +3153,31 @@
       <w:color w:val="467886" w:themeColor="hyperlink"/>
       <w:u w:val="single"/>
     </w:rPr>
+  </w:style>
+  <w:style w:type="character" w:styleId="UnresolvedMention">
+    <w:name w:val="Unresolved Mention"/>
+    <w:basedOn w:val="DefaultParagraphFont"/>
+    <w:uiPriority w:val="99"/>
+    <w:semiHidden/>
+    <w:unhideWhenUsed/>
+    <w:rsid w:val="00A803D5"/>
+    <w:rPr>
+      <w:color w:val="605E5C"/>
+      <w:shd w:val="clear" w:color="auto" w:fill="E1DFDD"/>
+    </w:rPr>
+  </w:style>
+  <w:style w:type="paragraph" w:styleId="TOC3">
+    <w:name w:val="toc 3"/>
+    <w:basedOn w:val="Normal"/>
+    <w:next w:val="Normal"/>
+    <w:autoRedefine/>
+    <w:uiPriority w:val="39"/>
+    <w:unhideWhenUsed/>
+    <w:rsid w:val="00C87907"/>
+    <w:pPr>
+      <w:spacing w:after="100"/>
+      <w:ind w:left="440"/>
+    </w:pPr>
   </w:style>
 </w:styles>
 </file>
@@ -2547,7 +3205,7 @@
       <inkml:brushProperty name="ignorePressure" value="1"/>
     </inkml:brush>
   </inkml:definitions>
-  <inkml:trace contextRef="#ctx0" brushRef="#br0">0 1358,'6851'-969,"-6832"966</inkml:trace>
+  <inkml:trace contextRef="#ctx0" brushRef="#br0">0 1496,'5611'-1107,"-5596"1104</inkml:trace>
 </inkml:ink>
 </file>
 
@@ -2576,6 +3234,33 @@
     </inkml:brush>
   </inkml:definitions>
   <inkml:trace contextRef="#ctx0" brushRef="#br0">0 0 24575,'0'0'-8191</inkml:trace>
+</inkml:ink>
+</file>
+
+<file path=word/ink/ink3.xml><?xml version="1.0" encoding="utf-8"?>
+<inkml:ink xmlns:inkml="http://www.w3.org/2003/InkML">
+  <inkml:definitions>
+    <inkml:context xml:id="ctx0">
+      <inkml:inkSource xml:id="inkSrc0">
+        <inkml:traceFormat>
+          <inkml:channel name="X" type="integer" min="-2.14748E9" max="2.14748E9" units="cm"/>
+          <inkml:channel name="Y" type="integer" min="-2.14748E9" max="2.14748E9" units="cm"/>
+        </inkml:traceFormat>
+        <inkml:channelProperties>
+          <inkml:channelProperty channel="X" name="resolution" value="1000" units="1/cm"/>
+          <inkml:channelProperty channel="Y" name="resolution" value="1000" units="1/cm"/>
+        </inkml:channelProperties>
+      </inkml:inkSource>
+      <inkml:timestamp xml:id="ts0" timeString="2026-03-19T12:01:20.023"/>
+    </inkml:context>
+    <inkml:brush xml:id="br0">
+      <inkml:brushProperty name="width" value="0.025" units="cm"/>
+      <inkml:brushProperty name="height" value="0.025" units="cm"/>
+      <inkml:brushProperty name="color" value="#E71224"/>
+      <inkml:brushProperty name="ignorePressure" value="1"/>
+    </inkml:brush>
+  </inkml:definitions>
+  <inkml:trace contextRef="#ctx0" brushRef="#br0">0 386,'2850'2714,"-2842"-2706</inkml:trace>
 </inkml:ink>
 </file>
 

</xml_diff>

<commit_message>
fixed issues with report
</commit_message>
<xml_diff>
--- a/COMP1004-Report.docx
+++ b/COMP1004-Report.docx
@@ -121,7 +121,7 @@
           <w:r>
             <w:fldChar w:fldCharType="separate"/>
           </w:r>
-          <w:hyperlink w:anchor="_Toc227530342" w:history="1">
+          <w:hyperlink w:anchor="_Toc228180791" w:history="1">
             <w:r>
               <w:rPr>
                 <w:rStyle w:val="Hyperlink"/>
@@ -148,7 +148,7 @@
                 <w:noProof/>
                 <w:webHidden/>
               </w:rPr>
-              <w:instrText xml:space="preserve"> PAGEREF _Toc227530342 \h </w:instrText>
+              <w:instrText xml:space="preserve"> PAGEREF _Toc228180791 \h </w:instrText>
             </w:r>
             <w:r>
               <w:rPr>
@@ -193,7 +193,7 @@
               <w:lang w:eastAsia="en-GB"/>
             </w:rPr>
           </w:pPr>
-          <w:hyperlink w:anchor="_Toc227530343" w:history="1">
+          <w:hyperlink w:anchor="_Toc228180792" w:history="1">
             <w:r>
               <w:rPr>
                 <w:rStyle w:val="Hyperlink"/>
@@ -220,7 +220,7 @@
                 <w:noProof/>
                 <w:webHidden/>
               </w:rPr>
-              <w:instrText xml:space="preserve"> PAGEREF _Toc227530343 \h </w:instrText>
+              <w:instrText xml:space="preserve"> PAGEREF _Toc228180792 \h </w:instrText>
             </w:r>
             <w:r>
               <w:rPr>
@@ -265,7 +265,7 @@
               <w:lang w:eastAsia="en-GB"/>
             </w:rPr>
           </w:pPr>
-          <w:hyperlink w:anchor="_Toc227530344" w:history="1">
+          <w:hyperlink w:anchor="_Toc228180793" w:history="1">
             <w:r>
               <w:rPr>
                 <w:rStyle w:val="Hyperlink"/>
@@ -292,7 +292,7 @@
                 <w:noProof/>
                 <w:webHidden/>
               </w:rPr>
-              <w:instrText xml:space="preserve"> PAGEREF _Toc227530344 \h </w:instrText>
+              <w:instrText xml:space="preserve"> PAGEREF _Toc228180793 \h </w:instrText>
             </w:r>
             <w:r>
               <w:rPr>
@@ -337,7 +337,7 @@
               <w:lang w:eastAsia="en-GB"/>
             </w:rPr>
           </w:pPr>
-          <w:hyperlink w:anchor="_Toc227530345" w:history="1">
+          <w:hyperlink w:anchor="_Toc228180794" w:history="1">
             <w:r>
               <w:rPr>
                 <w:rStyle w:val="Hyperlink"/>
@@ -364,7 +364,7 @@
                 <w:noProof/>
                 <w:webHidden/>
               </w:rPr>
-              <w:instrText xml:space="preserve"> PAGEREF _Toc227530345 \h </w:instrText>
+              <w:instrText xml:space="preserve"> PAGEREF _Toc228180794 \h </w:instrText>
             </w:r>
             <w:r>
               <w:rPr>
@@ -409,7 +409,7 @@
               <w:lang w:eastAsia="en-GB"/>
             </w:rPr>
           </w:pPr>
-          <w:hyperlink w:anchor="_Toc227530346" w:history="1">
+          <w:hyperlink w:anchor="_Toc228180795" w:history="1">
             <w:r>
               <w:rPr>
                 <w:rStyle w:val="Hyperlink"/>
@@ -436,7 +436,7 @@
                 <w:noProof/>
                 <w:webHidden/>
               </w:rPr>
-              <w:instrText xml:space="preserve"> PAGEREF _Toc227530346 \h </w:instrText>
+              <w:instrText xml:space="preserve"> PAGEREF _Toc228180795 \h </w:instrText>
             </w:r>
             <w:r>
               <w:rPr>
@@ -481,7 +481,7 @@
               <w:lang w:eastAsia="en-GB"/>
             </w:rPr>
           </w:pPr>
-          <w:hyperlink w:anchor="_Toc227530347" w:history="1">
+          <w:hyperlink w:anchor="_Toc228180796" w:history="1">
             <w:r>
               <w:rPr>
                 <w:rStyle w:val="Hyperlink"/>
@@ -508,7 +508,7 @@
                 <w:noProof/>
                 <w:webHidden/>
               </w:rPr>
-              <w:instrText xml:space="preserve"> PAGEREF _Toc227530347 \h </w:instrText>
+              <w:instrText xml:space="preserve"> PAGEREF _Toc228180796 \h </w:instrText>
             </w:r>
             <w:r>
               <w:rPr>
@@ -553,7 +553,7 @@
               <w:lang w:eastAsia="en-GB"/>
             </w:rPr>
           </w:pPr>
-          <w:hyperlink w:anchor="_Toc227530348" w:history="1">
+          <w:hyperlink w:anchor="_Toc228180797" w:history="1">
             <w:r>
               <w:rPr>
                 <w:rStyle w:val="Hyperlink"/>
@@ -580,7 +580,7 @@
                 <w:noProof/>
                 <w:webHidden/>
               </w:rPr>
-              <w:instrText xml:space="preserve"> PAGEREF _Toc227530348 \h </w:instrText>
+              <w:instrText xml:space="preserve"> PAGEREF _Toc228180797 \h </w:instrText>
             </w:r>
             <w:r>
               <w:rPr>
@@ -625,7 +625,7 @@
               <w:lang w:eastAsia="en-GB"/>
             </w:rPr>
           </w:pPr>
-          <w:hyperlink w:anchor="_Toc227530349" w:history="1">
+          <w:hyperlink w:anchor="_Toc228180798" w:history="1">
             <w:r>
               <w:rPr>
                 <w:rStyle w:val="Hyperlink"/>
@@ -652,7 +652,7 @@
                 <w:noProof/>
                 <w:webHidden/>
               </w:rPr>
-              <w:instrText xml:space="preserve"> PAGEREF _Toc227530349 \h </w:instrText>
+              <w:instrText xml:space="preserve"> PAGEREF _Toc228180798 \h </w:instrText>
             </w:r>
             <w:r>
               <w:rPr>
@@ -697,7 +697,7 @@
               <w:lang w:eastAsia="en-GB"/>
             </w:rPr>
           </w:pPr>
-          <w:hyperlink w:anchor="_Toc227530350" w:history="1">
+          <w:hyperlink w:anchor="_Toc228180799" w:history="1">
             <w:r>
               <w:rPr>
                 <w:rStyle w:val="Hyperlink"/>
@@ -724,7 +724,7 @@
                 <w:noProof/>
                 <w:webHidden/>
               </w:rPr>
-              <w:instrText xml:space="preserve"> PAGEREF _Toc227530350 \h </w:instrText>
+              <w:instrText xml:space="preserve"> PAGEREF _Toc228180799 \h </w:instrText>
             </w:r>
             <w:r>
               <w:rPr>
@@ -769,7 +769,7 @@
               <w:lang w:eastAsia="en-GB"/>
             </w:rPr>
           </w:pPr>
-          <w:hyperlink w:anchor="_Toc227530351" w:history="1">
+          <w:hyperlink w:anchor="_Toc228180800" w:history="1">
             <w:r>
               <w:rPr>
                 <w:rStyle w:val="Hyperlink"/>
@@ -796,7 +796,7 @@
                 <w:noProof/>
                 <w:webHidden/>
               </w:rPr>
-              <w:instrText xml:space="preserve"> PAGEREF _Toc227530351 \h </w:instrText>
+              <w:instrText xml:space="preserve"> PAGEREF _Toc228180800 \h </w:instrText>
             </w:r>
             <w:r>
               <w:rPr>
@@ -841,7 +841,7 @@
               <w:lang w:eastAsia="en-GB"/>
             </w:rPr>
           </w:pPr>
-          <w:hyperlink w:anchor="_Toc227530352" w:history="1">
+          <w:hyperlink w:anchor="_Toc228180801" w:history="1">
             <w:r>
               <w:rPr>
                 <w:rStyle w:val="Hyperlink"/>
@@ -868,7 +868,7 @@
                 <w:noProof/>
                 <w:webHidden/>
               </w:rPr>
-              <w:instrText xml:space="preserve"> PAGEREF _Toc227530352 \h </w:instrText>
+              <w:instrText xml:space="preserve"> PAGEREF _Toc228180801 \h </w:instrText>
             </w:r>
             <w:r>
               <w:rPr>
@@ -913,7 +913,7 @@
               <w:lang w:eastAsia="en-GB"/>
             </w:rPr>
           </w:pPr>
-          <w:hyperlink w:anchor="_Toc227530353" w:history="1">
+          <w:hyperlink w:anchor="_Toc228180802" w:history="1">
             <w:r>
               <w:rPr>
                 <w:rStyle w:val="Hyperlink"/>
@@ -940,7 +940,7 @@
                 <w:noProof/>
                 <w:webHidden/>
               </w:rPr>
-              <w:instrText xml:space="preserve"> PAGEREF _Toc227530353 \h </w:instrText>
+              <w:instrText xml:space="preserve"> PAGEREF _Toc228180802 \h </w:instrText>
             </w:r>
             <w:r>
               <w:rPr>
@@ -960,7 +960,7 @@
                 <w:noProof/>
                 <w:webHidden/>
               </w:rPr>
-              <w:t>8</w:t>
+              <w:t>9</w:t>
             </w:r>
             <w:r>
               <w:rPr>
@@ -985,7 +985,7 @@
               <w:lang w:eastAsia="en-GB"/>
             </w:rPr>
           </w:pPr>
-          <w:hyperlink w:anchor="_Toc227530354" w:history="1">
+          <w:hyperlink w:anchor="_Toc228180803" w:history="1">
             <w:r>
               <w:rPr>
                 <w:rStyle w:val="Hyperlink"/>
@@ -1012,7 +1012,7 @@
                 <w:noProof/>
                 <w:webHidden/>
               </w:rPr>
-              <w:instrText xml:space="preserve"> PAGEREF _Toc227530354 \h </w:instrText>
+              <w:instrText xml:space="preserve"> PAGEREF _Toc228180803 \h </w:instrText>
             </w:r>
             <w:r>
               <w:rPr>
@@ -1032,7 +1032,7 @@
                 <w:noProof/>
                 <w:webHidden/>
               </w:rPr>
-              <w:t>8</w:t>
+              <w:t>9</w:t>
             </w:r>
             <w:r>
               <w:rPr>
@@ -1057,7 +1057,7 @@
               <w:lang w:eastAsia="en-GB"/>
             </w:rPr>
           </w:pPr>
-          <w:hyperlink w:anchor="_Toc227530355" w:history="1">
+          <w:hyperlink w:anchor="_Toc228180804" w:history="1">
             <w:r>
               <w:rPr>
                 <w:rStyle w:val="Hyperlink"/>
@@ -1084,7 +1084,7 @@
                 <w:noProof/>
                 <w:webHidden/>
               </w:rPr>
-              <w:instrText xml:space="preserve"> PAGEREF _Toc227530355 \h </w:instrText>
+              <w:instrText xml:space="preserve"> PAGEREF _Toc228180804 \h </w:instrText>
             </w:r>
             <w:r>
               <w:rPr>
@@ -1104,7 +1104,7 @@
                 <w:noProof/>
                 <w:webHidden/>
               </w:rPr>
-              <w:t>8</w:t>
+              <w:t>9</w:t>
             </w:r>
             <w:r>
               <w:rPr>
@@ -1129,7 +1129,7 @@
               <w:lang w:eastAsia="en-GB"/>
             </w:rPr>
           </w:pPr>
-          <w:hyperlink w:anchor="_Toc227530356" w:history="1">
+          <w:hyperlink w:anchor="_Toc228180805" w:history="1">
             <w:r>
               <w:rPr>
                 <w:rStyle w:val="Hyperlink"/>
@@ -1156,7 +1156,7 @@
                 <w:noProof/>
                 <w:webHidden/>
               </w:rPr>
-              <w:instrText xml:space="preserve"> PAGEREF _Toc227530356 \h </w:instrText>
+              <w:instrText xml:space="preserve"> PAGEREF _Toc228180805 \h </w:instrText>
             </w:r>
             <w:r>
               <w:rPr>
@@ -1201,7 +1201,7 @@
               <w:lang w:eastAsia="en-GB"/>
             </w:rPr>
           </w:pPr>
-          <w:hyperlink w:anchor="_Toc227530357" w:history="1">
+          <w:hyperlink w:anchor="_Toc228180806" w:history="1">
             <w:r>
               <w:rPr>
                 <w:rStyle w:val="Hyperlink"/>
@@ -1228,7 +1228,7 @@
                 <w:noProof/>
                 <w:webHidden/>
               </w:rPr>
-              <w:instrText xml:space="preserve"> PAGEREF _Toc227530357 \h </w:instrText>
+              <w:instrText xml:space="preserve"> PAGEREF _Toc228180806 \h </w:instrText>
             </w:r>
             <w:r>
               <w:rPr>
@@ -1273,7 +1273,7 @@
               <w:lang w:eastAsia="en-GB"/>
             </w:rPr>
           </w:pPr>
-          <w:hyperlink w:anchor="_Toc227530358" w:history="1">
+          <w:hyperlink w:anchor="_Toc228180807" w:history="1">
             <w:r>
               <w:rPr>
                 <w:rStyle w:val="Hyperlink"/>
@@ -1300,7 +1300,7 @@
                 <w:noProof/>
                 <w:webHidden/>
               </w:rPr>
-              <w:instrText xml:space="preserve"> PAGEREF _Toc227530358 \h </w:instrText>
+              <w:instrText xml:space="preserve"> PAGEREF _Toc228180807 \h </w:instrText>
             </w:r>
             <w:r>
               <w:rPr>
@@ -1321,6 +1321,366 @@
                 <w:webHidden/>
               </w:rPr>
               <w:t>11</w:t>
+            </w:r>
+            <w:r>
+              <w:rPr>
+                <w:noProof/>
+                <w:webHidden/>
+              </w:rPr>
+              <w:fldChar w:fldCharType="end"/>
+            </w:r>
+          </w:hyperlink>
+        </w:p>
+        <w:p>
+          <w:pPr>
+            <w:pStyle w:val="TOC3"/>
+            <w:tabs>
+              <w:tab w:val="right" w:leader="dot" w:pos="9016"/>
+            </w:tabs>
+            <w:rPr>
+              <w:rFonts w:eastAsiaTheme="minorEastAsia"/>
+              <w:noProof/>
+              <w:sz w:val="24"/>
+              <w:szCs w:val="24"/>
+              <w:lang w:eastAsia="en-GB"/>
+            </w:rPr>
+          </w:pPr>
+          <w:hyperlink w:anchor="_Toc228180808" w:history="1">
+            <w:r>
+              <w:rPr>
+                <w:rStyle w:val="Hyperlink"/>
+                <w:noProof/>
+              </w:rPr>
+              <w:t>Log In Sequence Diagram</w:t>
+            </w:r>
+            <w:r>
+              <w:rPr>
+                <w:noProof/>
+                <w:webHidden/>
+              </w:rPr>
+              <w:tab/>
+            </w:r>
+            <w:r>
+              <w:rPr>
+                <w:noProof/>
+                <w:webHidden/>
+              </w:rPr>
+              <w:fldChar w:fldCharType="begin"/>
+            </w:r>
+            <w:r>
+              <w:rPr>
+                <w:noProof/>
+                <w:webHidden/>
+              </w:rPr>
+              <w:instrText xml:space="preserve"> PAGEREF _Toc228180808 \h </w:instrText>
+            </w:r>
+            <w:r>
+              <w:rPr>
+                <w:noProof/>
+                <w:webHidden/>
+              </w:rPr>
+            </w:r>
+            <w:r>
+              <w:rPr>
+                <w:noProof/>
+                <w:webHidden/>
+              </w:rPr>
+              <w:fldChar w:fldCharType="separate"/>
+            </w:r>
+            <w:r>
+              <w:rPr>
+                <w:noProof/>
+                <w:webHidden/>
+              </w:rPr>
+              <w:t>13</w:t>
+            </w:r>
+            <w:r>
+              <w:rPr>
+                <w:noProof/>
+                <w:webHidden/>
+              </w:rPr>
+              <w:fldChar w:fldCharType="end"/>
+            </w:r>
+          </w:hyperlink>
+        </w:p>
+        <w:p>
+          <w:pPr>
+            <w:pStyle w:val="TOC2"/>
+            <w:tabs>
+              <w:tab w:val="right" w:leader="dot" w:pos="9016"/>
+            </w:tabs>
+            <w:rPr>
+              <w:rFonts w:eastAsiaTheme="minorEastAsia"/>
+              <w:noProof/>
+              <w:sz w:val="24"/>
+              <w:szCs w:val="24"/>
+              <w:lang w:eastAsia="en-GB"/>
+            </w:rPr>
+          </w:pPr>
+          <w:hyperlink w:anchor="_Toc228180809" w:history="1">
+            <w:r>
+              <w:rPr>
+                <w:rStyle w:val="Hyperlink"/>
+                <w:noProof/>
+              </w:rPr>
+              <w:t>Algorithm Design</w:t>
+            </w:r>
+            <w:r>
+              <w:rPr>
+                <w:noProof/>
+                <w:webHidden/>
+              </w:rPr>
+              <w:tab/>
+            </w:r>
+            <w:r>
+              <w:rPr>
+                <w:noProof/>
+                <w:webHidden/>
+              </w:rPr>
+              <w:fldChar w:fldCharType="begin"/>
+            </w:r>
+            <w:r>
+              <w:rPr>
+                <w:noProof/>
+                <w:webHidden/>
+              </w:rPr>
+              <w:instrText xml:space="preserve"> PAGEREF _Toc228180809 \h </w:instrText>
+            </w:r>
+            <w:r>
+              <w:rPr>
+                <w:noProof/>
+                <w:webHidden/>
+              </w:rPr>
+            </w:r>
+            <w:r>
+              <w:rPr>
+                <w:noProof/>
+                <w:webHidden/>
+              </w:rPr>
+              <w:fldChar w:fldCharType="separate"/>
+            </w:r>
+            <w:r>
+              <w:rPr>
+                <w:noProof/>
+                <w:webHidden/>
+              </w:rPr>
+              <w:t>13</w:t>
+            </w:r>
+            <w:r>
+              <w:rPr>
+                <w:noProof/>
+                <w:webHidden/>
+              </w:rPr>
+              <w:fldChar w:fldCharType="end"/>
+            </w:r>
+          </w:hyperlink>
+        </w:p>
+        <w:p>
+          <w:pPr>
+            <w:pStyle w:val="TOC3"/>
+            <w:tabs>
+              <w:tab w:val="right" w:leader="dot" w:pos="9016"/>
+            </w:tabs>
+            <w:rPr>
+              <w:rFonts w:eastAsiaTheme="minorEastAsia"/>
+              <w:noProof/>
+              <w:sz w:val="24"/>
+              <w:szCs w:val="24"/>
+              <w:lang w:eastAsia="en-GB"/>
+            </w:rPr>
+          </w:pPr>
+          <w:hyperlink w:anchor="_Toc228180810" w:history="1">
+            <w:r>
+              <w:rPr>
+                <w:rStyle w:val="Hyperlink"/>
+                <w:noProof/>
+              </w:rPr>
+              <w:t>Salt/Key Generation</w:t>
+            </w:r>
+            <w:r>
+              <w:rPr>
+                <w:noProof/>
+                <w:webHidden/>
+              </w:rPr>
+              <w:tab/>
+            </w:r>
+            <w:r>
+              <w:rPr>
+                <w:noProof/>
+                <w:webHidden/>
+              </w:rPr>
+              <w:fldChar w:fldCharType="begin"/>
+            </w:r>
+            <w:r>
+              <w:rPr>
+                <w:noProof/>
+                <w:webHidden/>
+              </w:rPr>
+              <w:instrText xml:space="preserve"> PAGEREF _Toc228180810 \h </w:instrText>
+            </w:r>
+            <w:r>
+              <w:rPr>
+                <w:noProof/>
+                <w:webHidden/>
+              </w:rPr>
+            </w:r>
+            <w:r>
+              <w:rPr>
+                <w:noProof/>
+                <w:webHidden/>
+              </w:rPr>
+              <w:fldChar w:fldCharType="separate"/>
+            </w:r>
+            <w:r>
+              <w:rPr>
+                <w:noProof/>
+                <w:webHidden/>
+              </w:rPr>
+              <w:t>13</w:t>
+            </w:r>
+            <w:r>
+              <w:rPr>
+                <w:noProof/>
+                <w:webHidden/>
+              </w:rPr>
+              <w:fldChar w:fldCharType="end"/>
+            </w:r>
+          </w:hyperlink>
+        </w:p>
+        <w:p>
+          <w:pPr>
+            <w:pStyle w:val="TOC3"/>
+            <w:tabs>
+              <w:tab w:val="right" w:leader="dot" w:pos="9016"/>
+            </w:tabs>
+            <w:rPr>
+              <w:rFonts w:eastAsiaTheme="minorEastAsia"/>
+              <w:noProof/>
+              <w:sz w:val="24"/>
+              <w:szCs w:val="24"/>
+              <w:lang w:eastAsia="en-GB"/>
+            </w:rPr>
+          </w:pPr>
+          <w:hyperlink w:anchor="_Toc228180811" w:history="1">
+            <w:r>
+              <w:rPr>
+                <w:rStyle w:val="Hyperlink"/>
+                <w:noProof/>
+              </w:rPr>
+              <w:t>Encryption and Decryption</w:t>
+            </w:r>
+            <w:r>
+              <w:rPr>
+                <w:noProof/>
+                <w:webHidden/>
+              </w:rPr>
+              <w:tab/>
+            </w:r>
+            <w:r>
+              <w:rPr>
+                <w:noProof/>
+                <w:webHidden/>
+              </w:rPr>
+              <w:fldChar w:fldCharType="begin"/>
+            </w:r>
+            <w:r>
+              <w:rPr>
+                <w:noProof/>
+                <w:webHidden/>
+              </w:rPr>
+              <w:instrText xml:space="preserve"> PAGEREF _Toc228180811 \h </w:instrText>
+            </w:r>
+            <w:r>
+              <w:rPr>
+                <w:noProof/>
+                <w:webHidden/>
+              </w:rPr>
+            </w:r>
+            <w:r>
+              <w:rPr>
+                <w:noProof/>
+                <w:webHidden/>
+              </w:rPr>
+              <w:fldChar w:fldCharType="separate"/>
+            </w:r>
+            <w:r>
+              <w:rPr>
+                <w:noProof/>
+                <w:webHidden/>
+              </w:rPr>
+              <w:t>13</w:t>
+            </w:r>
+            <w:r>
+              <w:rPr>
+                <w:noProof/>
+                <w:webHidden/>
+              </w:rPr>
+              <w:fldChar w:fldCharType="end"/>
+            </w:r>
+          </w:hyperlink>
+        </w:p>
+        <w:p>
+          <w:pPr>
+            <w:pStyle w:val="TOC3"/>
+            <w:tabs>
+              <w:tab w:val="right" w:leader="dot" w:pos="9016"/>
+            </w:tabs>
+            <w:rPr>
+              <w:rFonts w:eastAsiaTheme="minorEastAsia"/>
+              <w:noProof/>
+              <w:sz w:val="24"/>
+              <w:szCs w:val="24"/>
+              <w:lang w:eastAsia="en-GB"/>
+            </w:rPr>
+          </w:pPr>
+          <w:hyperlink w:anchor="_Toc228180812" w:history="1">
+            <w:r>
+              <w:rPr>
+                <w:rStyle w:val="Hyperlink"/>
+                <w:noProof/>
+              </w:rPr>
+              <w:t>Hashing</w:t>
+            </w:r>
+            <w:r>
+              <w:rPr>
+                <w:noProof/>
+                <w:webHidden/>
+              </w:rPr>
+              <w:tab/>
+            </w:r>
+            <w:r>
+              <w:rPr>
+                <w:noProof/>
+                <w:webHidden/>
+              </w:rPr>
+              <w:fldChar w:fldCharType="begin"/>
+            </w:r>
+            <w:r>
+              <w:rPr>
+                <w:noProof/>
+                <w:webHidden/>
+              </w:rPr>
+              <w:instrText xml:space="preserve"> PAGEREF _Toc228180812 \h </w:instrText>
+            </w:r>
+            <w:r>
+              <w:rPr>
+                <w:noProof/>
+                <w:webHidden/>
+              </w:rPr>
+            </w:r>
+            <w:r>
+              <w:rPr>
+                <w:noProof/>
+                <w:webHidden/>
+              </w:rPr>
+              <w:fldChar w:fldCharType="separate"/>
+            </w:r>
+            <w:r>
+              <w:rPr>
+                <w:noProof/>
+                <w:webHidden/>
+              </w:rPr>
+              <w:t>14</w:t>
             </w:r>
             <w:r>
               <w:rPr>
@@ -1345,7 +1705,14 @@
               <w:lang w:eastAsia="en-GB"/>
             </w:rPr>
           </w:pPr>
-          <w:hyperlink w:anchor="_Toc227530359" w:history="1">
+          <w:hyperlink w:anchor="_Toc228180813" w:history="1">
+            <w:r>
+              <w:rPr>
+                <w:rStyle w:val="Hyperlink"/>
+                <w:noProof/>
+              </w:rPr>
+              <w:t>Noted Issues and Constraints</w:t>
+            </w:r>
             <w:r>
               <w:rPr>
                 <w:noProof/>
@@ -1365,7 +1732,7 @@
                 <w:noProof/>
                 <w:webHidden/>
               </w:rPr>
-              <w:instrText xml:space="preserve"> PAGEREF _Toc227530359 \h </w:instrText>
+              <w:instrText xml:space="preserve"> PAGEREF _Toc228180813 \h </w:instrText>
             </w:r>
             <w:r>
               <w:rPr>
@@ -1385,79 +1752,7 @@
                 <w:noProof/>
                 <w:webHidden/>
               </w:rPr>
-              <w:t>11</w:t>
-            </w:r>
-            <w:r>
-              <w:rPr>
-                <w:noProof/>
-                <w:webHidden/>
-              </w:rPr>
-              <w:fldChar w:fldCharType="end"/>
-            </w:r>
-          </w:hyperlink>
-        </w:p>
-        <w:p>
-          <w:pPr>
-            <w:pStyle w:val="TOC3"/>
-            <w:tabs>
-              <w:tab w:val="right" w:leader="dot" w:pos="9016"/>
-            </w:tabs>
-            <w:rPr>
-              <w:rFonts w:eastAsiaTheme="minorEastAsia"/>
-              <w:noProof/>
-              <w:sz w:val="24"/>
-              <w:szCs w:val="24"/>
-              <w:lang w:eastAsia="en-GB"/>
-            </w:rPr>
-          </w:pPr>
-          <w:hyperlink w:anchor="_Toc227530360" w:history="1">
-            <w:r>
-              <w:rPr>
-                <w:rStyle w:val="Hyperlink"/>
-                <w:noProof/>
-              </w:rPr>
-              <w:t>Sequence Diagrams</w:t>
-            </w:r>
-            <w:r>
-              <w:rPr>
-                <w:noProof/>
-                <w:webHidden/>
-              </w:rPr>
-              <w:tab/>
-            </w:r>
-            <w:r>
-              <w:rPr>
-                <w:noProof/>
-                <w:webHidden/>
-              </w:rPr>
-              <w:fldChar w:fldCharType="begin"/>
-            </w:r>
-            <w:r>
-              <w:rPr>
-                <w:noProof/>
-                <w:webHidden/>
-              </w:rPr>
-              <w:instrText xml:space="preserve"> PAGEREF _Toc227530360 \h </w:instrText>
-            </w:r>
-            <w:r>
-              <w:rPr>
-                <w:noProof/>
-                <w:webHidden/>
-              </w:rPr>
-            </w:r>
-            <w:r>
-              <w:rPr>
-                <w:noProof/>
-                <w:webHidden/>
-              </w:rPr>
-              <w:fldChar w:fldCharType="separate"/>
-            </w:r>
-            <w:r>
-              <w:rPr>
-                <w:noProof/>
-                <w:webHidden/>
-              </w:rPr>
-              <w:t>13</w:t>
+              <w:t>15</w:t>
             </w:r>
             <w:r>
               <w:rPr>
@@ -1482,13 +1777,13 @@
               <w:lang w:eastAsia="en-GB"/>
             </w:rPr>
           </w:pPr>
-          <w:hyperlink w:anchor="_Toc227530361" w:history="1">
+          <w:hyperlink w:anchor="_Toc228180814" w:history="1">
             <w:r>
               <w:rPr>
                 <w:rStyle w:val="Hyperlink"/>
                 <w:noProof/>
               </w:rPr>
-              <w:t>Algorithm Design</w:t>
+              <w:t>LESP Issues</w:t>
             </w:r>
             <w:r>
               <w:rPr>
@@ -1509,7 +1804,7 @@
                 <w:noProof/>
                 <w:webHidden/>
               </w:rPr>
-              <w:instrText xml:space="preserve"> PAGEREF _Toc227530361 \h </w:instrText>
+              <w:instrText xml:space="preserve"> PAGEREF _Toc228180814 \h </w:instrText>
             </w:r>
             <w:r>
               <w:rPr>
@@ -1529,7 +1824,7 @@
                 <w:noProof/>
                 <w:webHidden/>
               </w:rPr>
-              <w:t>13</w:t>
+              <w:t>15</w:t>
             </w:r>
             <w:r>
               <w:rPr>
@@ -1542,7 +1837,7 @@
         </w:p>
         <w:p>
           <w:pPr>
-            <w:pStyle w:val="TOC3"/>
+            <w:pStyle w:val="TOC2"/>
             <w:tabs>
               <w:tab w:val="right" w:leader="dot" w:pos="9016"/>
             </w:tabs>
@@ -1554,13 +1849,13 @@
               <w:lang w:eastAsia="en-GB"/>
             </w:rPr>
           </w:pPr>
-          <w:hyperlink w:anchor="_Toc227530362" w:history="1">
+          <w:hyperlink w:anchor="_Toc228180815" w:history="1">
             <w:r>
               <w:rPr>
                 <w:rStyle w:val="Hyperlink"/>
                 <w:noProof/>
               </w:rPr>
-              <w:t>Salt/Key Generation</w:t>
+              <w:t>GitHub Repository Link</w:t>
             </w:r>
             <w:r>
               <w:rPr>
@@ -1581,7 +1876,7 @@
                 <w:noProof/>
                 <w:webHidden/>
               </w:rPr>
-              <w:instrText xml:space="preserve"> PAGEREF _Toc227530362 \h </w:instrText>
+              <w:instrText xml:space="preserve"> PAGEREF _Toc228180815 \h </w:instrText>
             </w:r>
             <w:r>
               <w:rPr>
@@ -1601,151 +1896,7 @@
                 <w:noProof/>
                 <w:webHidden/>
               </w:rPr>
-              <w:t>13</w:t>
-            </w:r>
-            <w:r>
-              <w:rPr>
-                <w:noProof/>
-                <w:webHidden/>
-              </w:rPr>
-              <w:fldChar w:fldCharType="end"/>
-            </w:r>
-          </w:hyperlink>
-        </w:p>
-        <w:p>
-          <w:pPr>
-            <w:pStyle w:val="TOC3"/>
-            <w:tabs>
-              <w:tab w:val="right" w:leader="dot" w:pos="9016"/>
-            </w:tabs>
-            <w:rPr>
-              <w:rFonts w:eastAsiaTheme="minorEastAsia"/>
-              <w:noProof/>
-              <w:sz w:val="24"/>
-              <w:szCs w:val="24"/>
-              <w:lang w:eastAsia="en-GB"/>
-            </w:rPr>
-          </w:pPr>
-          <w:hyperlink w:anchor="_Toc227530363" w:history="1">
-            <w:r>
-              <w:rPr>
-                <w:rStyle w:val="Hyperlink"/>
-                <w:noProof/>
-              </w:rPr>
-              <w:t>Encryption and Decryption</w:t>
-            </w:r>
-            <w:r>
-              <w:rPr>
-                <w:noProof/>
-                <w:webHidden/>
-              </w:rPr>
-              <w:tab/>
-            </w:r>
-            <w:r>
-              <w:rPr>
-                <w:noProof/>
-                <w:webHidden/>
-              </w:rPr>
-              <w:fldChar w:fldCharType="begin"/>
-            </w:r>
-            <w:r>
-              <w:rPr>
-                <w:noProof/>
-                <w:webHidden/>
-              </w:rPr>
-              <w:instrText xml:space="preserve"> PAGEREF _Toc227530363 \h </w:instrText>
-            </w:r>
-            <w:r>
-              <w:rPr>
-                <w:noProof/>
-                <w:webHidden/>
-              </w:rPr>
-            </w:r>
-            <w:r>
-              <w:rPr>
-                <w:noProof/>
-                <w:webHidden/>
-              </w:rPr>
-              <w:fldChar w:fldCharType="separate"/>
-            </w:r>
-            <w:r>
-              <w:rPr>
-                <w:noProof/>
-                <w:webHidden/>
-              </w:rPr>
-              <w:t>13</w:t>
-            </w:r>
-            <w:r>
-              <w:rPr>
-                <w:noProof/>
-                <w:webHidden/>
-              </w:rPr>
-              <w:fldChar w:fldCharType="end"/>
-            </w:r>
-          </w:hyperlink>
-        </w:p>
-        <w:p>
-          <w:pPr>
-            <w:pStyle w:val="TOC3"/>
-            <w:tabs>
-              <w:tab w:val="right" w:leader="dot" w:pos="9016"/>
-            </w:tabs>
-            <w:rPr>
-              <w:rFonts w:eastAsiaTheme="minorEastAsia"/>
-              <w:noProof/>
-              <w:sz w:val="24"/>
-              <w:szCs w:val="24"/>
-              <w:lang w:eastAsia="en-GB"/>
-            </w:rPr>
-          </w:pPr>
-          <w:hyperlink w:anchor="_Toc227530364" w:history="1">
-            <w:r>
-              <w:rPr>
-                <w:rStyle w:val="Hyperlink"/>
-                <w:noProof/>
-              </w:rPr>
-              <w:t>Hashing</w:t>
-            </w:r>
-            <w:r>
-              <w:rPr>
-                <w:noProof/>
-                <w:webHidden/>
-              </w:rPr>
-              <w:tab/>
-            </w:r>
-            <w:r>
-              <w:rPr>
-                <w:noProof/>
-                <w:webHidden/>
-              </w:rPr>
-              <w:fldChar w:fldCharType="begin"/>
-            </w:r>
-            <w:r>
-              <w:rPr>
-                <w:noProof/>
-                <w:webHidden/>
-              </w:rPr>
-              <w:instrText xml:space="preserve"> PAGEREF _Toc227530364 \h </w:instrText>
-            </w:r>
-            <w:r>
-              <w:rPr>
-                <w:noProof/>
-                <w:webHidden/>
-              </w:rPr>
-            </w:r>
-            <w:r>
-              <w:rPr>
-                <w:noProof/>
-                <w:webHidden/>
-              </w:rPr>
-              <w:fldChar w:fldCharType="separate"/>
-            </w:r>
-            <w:r>
-              <w:rPr>
-                <w:noProof/>
-                <w:webHidden/>
-              </w:rPr>
-              <w:t>14</w:t>
+              <w:t>15</w:t>
             </w:r>
             <w:r>
               <w:rPr>
@@ -1770,13 +1921,13 @@
               <w:lang w:eastAsia="en-GB"/>
             </w:rPr>
           </w:pPr>
-          <w:hyperlink w:anchor="_Toc227530365" w:history="1">
+          <w:hyperlink w:anchor="_Toc228180816" w:history="1">
             <w:r>
               <w:rPr>
                 <w:rStyle w:val="Hyperlink"/>
                 <w:noProof/>
               </w:rPr>
-              <w:t>Noted Issues and Constraints</w:t>
+              <w:t>Appendix</w:t>
             </w:r>
             <w:r>
               <w:rPr>
@@ -1797,7 +1948,7 @@
                 <w:noProof/>
                 <w:webHidden/>
               </w:rPr>
-              <w:instrText xml:space="preserve"> PAGEREF _Toc227530365 \h </w:instrText>
+              <w:instrText xml:space="preserve"> PAGEREF _Toc228180816 \h </w:instrText>
             </w:r>
             <w:r>
               <w:rPr>
@@ -1817,7 +1968,7 @@
                 <w:noProof/>
                 <w:webHidden/>
               </w:rPr>
-              <w:t>15</w:t>
+              <w:t>16</w:t>
             </w:r>
             <w:r>
               <w:rPr>
@@ -1842,13 +1993,13 @@
               <w:lang w:eastAsia="en-GB"/>
             </w:rPr>
           </w:pPr>
-          <w:hyperlink w:anchor="_Toc227530366" w:history="1">
+          <w:hyperlink w:anchor="_Toc228180817" w:history="1">
             <w:r>
               <w:rPr>
                 <w:rStyle w:val="Hyperlink"/>
                 <w:noProof/>
               </w:rPr>
-              <w:t>Github Repository Link</w:t>
+              <w:t>Testing Table</w:t>
             </w:r>
             <w:r>
               <w:rPr>
@@ -1869,79 +2020,7 @@
                 <w:noProof/>
                 <w:webHidden/>
               </w:rPr>
-              <w:instrText xml:space="preserve"> PAGEREF _Toc227530366 \h </w:instrText>
-            </w:r>
-            <w:r>
-              <w:rPr>
-                <w:noProof/>
-                <w:webHidden/>
-              </w:rPr>
-            </w:r>
-            <w:r>
-              <w:rPr>
-                <w:noProof/>
-                <w:webHidden/>
-              </w:rPr>
-              <w:fldChar w:fldCharType="separate"/>
-            </w:r>
-            <w:r>
-              <w:rPr>
-                <w:noProof/>
-                <w:webHidden/>
-              </w:rPr>
-              <w:t>15</w:t>
-            </w:r>
-            <w:r>
-              <w:rPr>
-                <w:noProof/>
-                <w:webHidden/>
-              </w:rPr>
-              <w:fldChar w:fldCharType="end"/>
-            </w:r>
-          </w:hyperlink>
-        </w:p>
-        <w:p>
-          <w:pPr>
-            <w:pStyle w:val="TOC1"/>
-            <w:tabs>
-              <w:tab w:val="right" w:leader="dot" w:pos="9016"/>
-            </w:tabs>
-            <w:rPr>
-              <w:rFonts w:eastAsiaTheme="minorEastAsia"/>
-              <w:noProof/>
-              <w:sz w:val="24"/>
-              <w:szCs w:val="24"/>
-              <w:lang w:eastAsia="en-GB"/>
-            </w:rPr>
-          </w:pPr>
-          <w:hyperlink w:anchor="_Toc227530367" w:history="1">
-            <w:r>
-              <w:rPr>
-                <w:rStyle w:val="Hyperlink"/>
-                <w:noProof/>
-              </w:rPr>
-              <w:t>Appendix</w:t>
-            </w:r>
-            <w:r>
-              <w:rPr>
-                <w:noProof/>
-                <w:webHidden/>
-              </w:rPr>
-              <w:tab/>
-            </w:r>
-            <w:r>
-              <w:rPr>
-                <w:noProof/>
-                <w:webHidden/>
-              </w:rPr>
-              <w:fldChar w:fldCharType="begin"/>
-            </w:r>
-            <w:r>
-              <w:rPr>
-                <w:noProof/>
-                <w:webHidden/>
-              </w:rPr>
-              <w:instrText xml:space="preserve"> PAGEREF _Toc227530367 \h </w:instrText>
+              <w:instrText xml:space="preserve"> PAGEREF _Toc228180817 \h </w:instrText>
             </w:r>
             <w:r>
               <w:rPr>
@@ -1986,13 +2065,13 @@
               <w:lang w:eastAsia="en-GB"/>
             </w:rPr>
           </w:pPr>
-          <w:hyperlink w:anchor="_Toc227530368" w:history="1">
+          <w:hyperlink w:anchor="_Toc228180818" w:history="1">
             <w:r>
               <w:rPr>
                 <w:rStyle w:val="Hyperlink"/>
                 <w:noProof/>
               </w:rPr>
-              <w:t>Testing Table</w:t>
+              <w:t>References</w:t>
             </w:r>
             <w:r>
               <w:rPr>
@@ -2013,7 +2092,7 @@
                 <w:noProof/>
                 <w:webHidden/>
               </w:rPr>
-              <w:instrText xml:space="preserve"> PAGEREF _Toc227530368 \h </w:instrText>
+              <w:instrText xml:space="preserve"> PAGEREF _Toc228180818 \h </w:instrText>
             </w:r>
             <w:r>
               <w:rPr>
@@ -2033,79 +2112,7 @@
                 <w:noProof/>
                 <w:webHidden/>
               </w:rPr>
-              <w:t>16</w:t>
-            </w:r>
-            <w:r>
-              <w:rPr>
-                <w:noProof/>
-                <w:webHidden/>
-              </w:rPr>
-              <w:fldChar w:fldCharType="end"/>
-            </w:r>
-          </w:hyperlink>
-        </w:p>
-        <w:p>
-          <w:pPr>
-            <w:pStyle w:val="TOC2"/>
-            <w:tabs>
-              <w:tab w:val="right" w:leader="dot" w:pos="9016"/>
-            </w:tabs>
-            <w:rPr>
-              <w:rFonts w:eastAsiaTheme="minorEastAsia"/>
-              <w:noProof/>
-              <w:sz w:val="24"/>
-              <w:szCs w:val="24"/>
-              <w:lang w:eastAsia="en-GB"/>
-            </w:rPr>
-          </w:pPr>
-          <w:hyperlink w:anchor="_Toc227530369" w:history="1">
-            <w:r>
-              <w:rPr>
-                <w:rStyle w:val="Hyperlink"/>
-                <w:noProof/>
-              </w:rPr>
-              <w:t>References</w:t>
-            </w:r>
-            <w:r>
-              <w:rPr>
-                <w:noProof/>
-                <w:webHidden/>
-              </w:rPr>
-              <w:tab/>
-            </w:r>
-            <w:r>
-              <w:rPr>
-                <w:noProof/>
-                <w:webHidden/>
-              </w:rPr>
-              <w:fldChar w:fldCharType="begin"/>
-            </w:r>
-            <w:r>
-              <w:rPr>
-                <w:noProof/>
-                <w:webHidden/>
-              </w:rPr>
-              <w:instrText xml:space="preserve"> PAGEREF _Toc227530369 \h </w:instrText>
-            </w:r>
-            <w:r>
-              <w:rPr>
-                <w:noProof/>
-                <w:webHidden/>
-              </w:rPr>
-            </w:r>
-            <w:r>
-              <w:rPr>
-                <w:noProof/>
-                <w:webHidden/>
-              </w:rPr>
-              <w:fldChar w:fldCharType="separate"/>
-            </w:r>
-            <w:r>
-              <w:rPr>
-                <w:noProof/>
-                <w:webHidden/>
-              </w:rPr>
-              <w:t>16</w:t>
+              <w:t>17</w:t>
             </w:r>
             <w:r>
               <w:rPr>
@@ -2147,7 +2154,7 @@
       <w:pPr>
         <w:pStyle w:val="Heading1"/>
       </w:pPr>
-      <w:bookmarkStart w:id="0" w:name="_Toc227530342"/>
+      <w:bookmarkStart w:id="0" w:name="_Toc228180791"/>
       <w:r>
         <w:lastRenderedPageBreak/>
         <w:t>Introduction</w:t>
@@ -2238,7 +2245,7 @@
       <w:pPr>
         <w:pStyle w:val="Heading1"/>
       </w:pPr>
-      <w:bookmarkStart w:id="1" w:name="_Toc227530343"/>
+      <w:bookmarkStart w:id="1" w:name="_Toc228180792"/>
       <w:r>
         <w:t>Software Development Lifecycle</w:t>
       </w:r>
@@ -2732,7 +2739,7 @@
       <w:pPr>
         <w:pStyle w:val="Heading2"/>
       </w:pPr>
-      <w:bookmarkStart w:id="2" w:name="_Toc227530344"/>
+      <w:bookmarkStart w:id="2" w:name="_Toc228180793"/>
       <w:r>
         <w:lastRenderedPageBreak/>
         <w:t>Sprint Backlog</w:t>
@@ -2760,7 +2767,7 @@
       <w:pPr>
         <w:pStyle w:val="Heading3"/>
       </w:pPr>
-      <w:bookmarkStart w:id="3" w:name="_Toc227530345"/>
+      <w:bookmarkStart w:id="3" w:name="_Toc228180794"/>
       <w:r>
         <w:t>Sprint 1</w:t>
       </w:r>
@@ -2964,7 +2971,7 @@
       <w:pPr>
         <w:pStyle w:val="Heading3"/>
       </w:pPr>
-      <w:bookmarkStart w:id="4" w:name="_Toc227530346"/>
+      <w:bookmarkStart w:id="4" w:name="_Toc228180795"/>
       <w:r>
         <w:t>Sprint 2</w:t>
       </w:r>
@@ -3163,7 +3170,7 @@
       <w:pPr>
         <w:pStyle w:val="Heading3"/>
       </w:pPr>
-      <w:bookmarkStart w:id="5" w:name="_Toc227530347"/>
+      <w:bookmarkStart w:id="5" w:name="_Toc228180796"/>
       <w:r>
         <w:t>Sprint 3</w:t>
       </w:r>
@@ -3309,7 +3316,7 @@
       <w:pPr>
         <w:pStyle w:val="Heading3"/>
       </w:pPr>
-      <w:bookmarkStart w:id="6" w:name="_Toc227530348"/>
+      <w:bookmarkStart w:id="6" w:name="_Toc228180797"/>
       <w:r>
         <w:t>Sprint 4</w:t>
       </w:r>
@@ -3544,7 +3551,7 @@
       <w:pPr>
         <w:pStyle w:val="Heading3"/>
       </w:pPr>
-      <w:bookmarkStart w:id="7" w:name="_Toc227530349"/>
+      <w:bookmarkStart w:id="7" w:name="_Toc228180798"/>
       <w:r>
         <w:t>Sprint 5</w:t>
       </w:r>
@@ -3728,7 +3735,7 @@
           <w:strike/>
         </w:rPr>
       </w:pPr>
-      <w:bookmarkStart w:id="8" w:name="_Toc227530350"/>
+      <w:bookmarkStart w:id="8" w:name="_Toc228180799"/>
       <w:r>
         <w:t>Sprint 6</w:t>
       </w:r>
@@ -3899,7 +3906,7 @@
           <w:strike/>
         </w:rPr>
       </w:pPr>
-      <w:bookmarkStart w:id="9" w:name="_Toc227530351"/>
+      <w:bookmarkStart w:id="9" w:name="_Toc228180800"/>
       <w:r>
         <w:t>Sprint 7</w:t>
       </w:r>
@@ -4189,7 +4196,7 @@
       <w:r>
         <w:t xml:space="preserve"> </w:t>
       </w:r>
-      <w:bookmarkStart w:id="10" w:name="_Toc227530352"/>
+      <w:bookmarkStart w:id="10" w:name="_Toc228180801"/>
       <w:r>
         <w:t xml:space="preserve">Sprint </w:t>
       </w:r>
@@ -4351,7 +4358,6 @@
           <w:szCs w:val="40"/>
         </w:rPr>
       </w:pPr>
-      <w:bookmarkStart w:id="11" w:name="_Toc227530353"/>
       <w:r>
         <w:br w:type="page"/>
       </w:r>
@@ -4366,6 +4372,7 @@
           <w:szCs w:val="22"/>
         </w:rPr>
       </w:pPr>
+      <w:bookmarkStart w:id="11" w:name="_Toc228180802"/>
       <w:r>
         <w:lastRenderedPageBreak/>
         <w:t>Design Document</w:t>
@@ -4384,7 +4391,7 @@
       <w:pPr>
         <w:pStyle w:val="Heading2"/>
       </w:pPr>
-      <w:bookmarkStart w:id="12" w:name="_Toc227530354"/>
+      <w:bookmarkStart w:id="12" w:name="_Toc228180803"/>
       <w:r>
         <w:t>Project Vision</w:t>
       </w:r>
@@ -4503,7 +4510,7 @@
       <w:pPr>
         <w:pStyle w:val="Heading2"/>
       </w:pPr>
-      <w:bookmarkStart w:id="13" w:name="_Toc227530355"/>
+      <w:bookmarkStart w:id="13" w:name="_Toc228180804"/>
       <w:r>
         <w:t>Background</w:t>
       </w:r>
@@ -4746,7 +4753,7 @@
       <w:pPr>
         <w:pStyle w:val="Heading2"/>
       </w:pPr>
-      <w:bookmarkStart w:id="14" w:name="_Toc227530356"/>
+      <w:bookmarkStart w:id="14" w:name="_Toc228180805"/>
       <w:r>
         <w:lastRenderedPageBreak/>
         <w:t>UML diagrams</w:t>
@@ -4765,7 +4772,7 @@
       <w:pPr>
         <w:pStyle w:val="Heading3"/>
       </w:pPr>
-      <w:bookmarkStart w:id="15" w:name="_Toc227530357"/>
+      <w:bookmarkStart w:id="15" w:name="_Toc228180806"/>
       <w:r>
         <w:t>Sitemap</w:t>
       </w:r>
@@ -4885,7 +4892,7 @@
       <w:pPr>
         <w:pStyle w:val="Heading3"/>
       </w:pPr>
-      <w:bookmarkStart w:id="16" w:name="_Toc227530358"/>
+      <w:bookmarkStart w:id="16" w:name="_Toc228180807"/>
       <w:r>
         <w:lastRenderedPageBreak/>
         <w:t>Wireframes</w:t>
@@ -5473,13 +5480,12 @@
       </w:r>
     </w:p>
     <w:p>
-      <w:bookmarkStart w:id="17" w:name="_Toc227530359"/>
       <w:r>
         <w:rPr>
           <w:noProof/>
         </w:rPr>
         <w:drawing>
-          <wp:anchor distT="0" distB="0" distL="114300" distR="114300" simplePos="0" relativeHeight="251657215" behindDoc="0" locked="0" layoutInCell="1" allowOverlap="1" wp14:anchorId="26116EE4" wp14:editId="7FFA26C4">
+          <wp:anchor distT="0" distB="0" distL="114300" distR="114300" simplePos="0" relativeHeight="251657215" behindDoc="0" locked="0" layoutInCell="1" allowOverlap="1" wp14:anchorId="26116EE4" wp14:editId="53676792">
             <wp:simplePos x="0" y="0"/>
             <wp:positionH relativeFrom="margin">
               <wp:posOffset>1169670</wp:posOffset>
@@ -5612,7 +5618,6 @@
           </mc:Fallback>
         </mc:AlternateContent>
       </w:r>
-      <w:bookmarkEnd w:id="17"/>
     </w:p>
     <w:p>
       <w:pPr>
@@ -6563,6 +6568,7 @@
       <w:pPr>
         <w:pStyle w:val="Heading3"/>
       </w:pPr>
+      <w:bookmarkStart w:id="17" w:name="_Toc228180808"/>
       <w:r>
         <w:lastRenderedPageBreak/>
         <w:t xml:space="preserve">Log </w:t>
@@ -6582,6 +6588,7 @@
       <w:r>
         <w:t xml:space="preserve"> Diagram</w:t>
       </w:r>
+      <w:bookmarkEnd w:id="17"/>
     </w:p>
     <w:p>
       <w:r>
@@ -6667,7 +6674,7 @@
       <w:pPr>
         <w:pStyle w:val="Heading2"/>
       </w:pPr>
-      <w:bookmarkStart w:id="18" w:name="_Toc227530361"/>
+      <w:bookmarkStart w:id="18" w:name="_Toc228180809"/>
       <w:r>
         <w:t>Algorithm Design</w:t>
       </w:r>
@@ -6691,7 +6698,7 @@
       <w:pPr>
         <w:pStyle w:val="Heading3"/>
       </w:pPr>
-      <w:bookmarkStart w:id="19" w:name="_Toc227530362"/>
+      <w:bookmarkStart w:id="19" w:name="_Toc228180810"/>
       <w:r>
         <w:t>Salt/Key Generation</w:t>
       </w:r>
@@ -6772,7 +6779,7 @@
       <w:pPr>
         <w:pStyle w:val="Heading3"/>
       </w:pPr>
-      <w:bookmarkStart w:id="20" w:name="_Toc227530363"/>
+      <w:bookmarkStart w:id="20" w:name="_Toc228180811"/>
       <w:r>
         <w:t>Encryption and Decryption</w:t>
       </w:r>
@@ -6866,7 +6873,7 @@
       <w:pPr>
         <w:pStyle w:val="Heading3"/>
       </w:pPr>
-      <w:bookmarkStart w:id="21" w:name="_Toc227530364"/>
+      <w:bookmarkStart w:id="21" w:name="_Toc228180812"/>
       <w:r>
         <w:t>Hashing</w:t>
       </w:r>
@@ -7134,7 +7141,7 @@
       <w:pPr>
         <w:pStyle w:val="Heading1"/>
       </w:pPr>
-      <w:bookmarkStart w:id="22" w:name="_Toc227530365"/>
+      <w:bookmarkStart w:id="22" w:name="_Toc228180813"/>
       <w:r>
         <w:lastRenderedPageBreak/>
         <w:t>Noted Issues and Constraints</w:t>
@@ -7281,9 +7288,11 @@
       <w:pPr>
         <w:pStyle w:val="Heading2"/>
       </w:pPr>
+      <w:bookmarkStart w:id="23" w:name="_Toc228180814"/>
       <w:r>
         <w:t>LESP Issues</w:t>
       </w:r>
+      <w:bookmarkEnd w:id="23"/>
     </w:p>
     <w:p>
       <w:r>
@@ -7371,14 +7380,14 @@
       <w:pPr>
         <w:pStyle w:val="Heading2"/>
       </w:pPr>
-      <w:bookmarkStart w:id="23" w:name="_Toc227530366"/>
+      <w:bookmarkStart w:id="24" w:name="_Toc228180815"/>
       <w:r>
         <w:t>GitHub</w:t>
       </w:r>
       <w:r>
         <w:t xml:space="preserve"> Repository Link</w:t>
       </w:r>
-      <w:bookmarkEnd w:id="23"/>
+      <w:bookmarkEnd w:id="24"/>
     </w:p>
     <w:p>
       <w:r>
@@ -7402,22 +7411,22 @@
       <w:pPr>
         <w:pStyle w:val="Heading1"/>
       </w:pPr>
-      <w:bookmarkStart w:id="24" w:name="_Toc227530367"/>
+      <w:bookmarkStart w:id="25" w:name="_Toc228180816"/>
       <w:r>
         <w:lastRenderedPageBreak/>
         <w:t>Appendix</w:t>
       </w:r>
-      <w:bookmarkEnd w:id="24"/>
+      <w:bookmarkEnd w:id="25"/>
     </w:p>
     <w:p>
       <w:pPr>
         <w:pStyle w:val="Heading2"/>
       </w:pPr>
-      <w:bookmarkStart w:id="25" w:name="_Toc227530368"/>
+      <w:bookmarkStart w:id="26" w:name="_Toc228180817"/>
       <w:r>
         <w:t>Testing Table</w:t>
       </w:r>
-      <w:bookmarkEnd w:id="25"/>
+      <w:bookmarkEnd w:id="26"/>
     </w:p>
     <w:p>
       <w:r>
@@ -8385,11 +8394,11 @@
       <w:pPr>
         <w:pStyle w:val="Heading2"/>
       </w:pPr>
-      <w:bookmarkStart w:id="26" w:name="_Toc227530369"/>
+      <w:bookmarkStart w:id="27" w:name="_Toc228180818"/>
       <w:r>
         <w:t>References</w:t>
       </w:r>
-      <w:bookmarkEnd w:id="26"/>
+      <w:bookmarkEnd w:id="27"/>
     </w:p>
     <w:p>
       <w:r>
@@ -8791,19 +8800,7 @@
           <w:rPr>
             <w:rStyle w:val="Hyperlink"/>
           </w:rPr>
-          <w:t>https://www.xda-developers.com/best-private-note-taking-apps-fo</w:t>
-        </w:r>
-        <w:r>
-          <w:rPr>
-            <w:rStyle w:val="Hyperlink"/>
-          </w:rPr>
-          <w:t>r</w:t>
-        </w:r>
-        <w:r>
-          <w:rPr>
-            <w:rStyle w:val="Hyperlink"/>
-          </w:rPr>
-          <w:t>-ultimate-security/</w:t>
+          <w:t>https://www.xda-developers.com/best-private-note-taking-apps-for-ultimate-security/</w:t>
         </w:r>
       </w:hyperlink>
       <w:r>
@@ -10227,6 +10224,7 @@
   <w:style w:type="character" w:default="1" w:styleId="DefaultParagraphFont">
     <w:name w:val="Default Paragraph Font"/>
     <w:uiPriority w:val="1"/>
+    <w:semiHidden/>
     <w:unhideWhenUsed/>
   </w:style>
   <w:style w:type="table" w:default="1" w:styleId="TableNormal">

</xml_diff>

<commit_message>
fixing a few things
</commit_message>
<xml_diff>
--- a/COMP1004-Report.docx
+++ b/COMP1004-Report.docx
@@ -3081,7 +3081,7 @@
           </w:tcPr>
           <w:p>
             <w:r>
-              <w:t>Design the security for the website *</w:t>
+              <w:t>Design the security for the website</w:t>
             </w:r>
           </w:p>
         </w:tc>
@@ -3104,13 +3104,14 @@
       </w:r>
     </w:p>
     <w:p>
-      <w:pPr>
-        <w:pBdr>
-          <w:bottom w:val="single" w:sz="6" w:space="1" w:color="auto"/>
-        </w:pBdr>
-      </w:pPr>
-      <w:r>
-        <w:t>The architecture of the code is designed, so when programming starts it is easy to know what to code and the security has been researched and designed.</w:t>
+      <w:r>
+        <w:t>The architecture of the code is designed, so when programming starts it is easy to know what to code and the security has bee</w:t>
+      </w:r>
+      <w:r>
+        <w:t>n</w:t>
+      </w:r>
+      <w:r>
+        <w:t xml:space="preserve"> researched and designed.</w:t>
       </w:r>
     </w:p>
     <w:p>
@@ -3130,40 +3131,15 @@
         <w:pStyle w:val="Footer"/>
       </w:pPr>
       <w:r>
-        <w:t>Research for the security led to me realising that the initial idea of using End-To-End encryption to stand out from other notes applications</w:t>
-      </w:r>
-      <w:r>
-        <w:t xml:space="preserve"> was too complicated and out of scope for this particular project. </w:t>
-      </w:r>
-      <w:proofErr w:type="gramStart"/>
-      <w:r>
-        <w:t>So</w:t>
-      </w:r>
-      <w:proofErr w:type="gramEnd"/>
-      <w:r>
-        <w:t xml:space="preserve"> the</w:t>
-      </w:r>
-      <w:r>
-        <w:t xml:space="preserve"> security for the website was initially designed here</w:t>
-      </w:r>
-      <w:r>
-        <w:t xml:space="preserve"> using</w:t>
-      </w:r>
-      <w:r>
-        <w:t xml:space="preserve"> node.js crypto module, but no end-to-end encryption</w:t>
-      </w:r>
-      <w:r>
-        <w:t xml:space="preserve">, </w:t>
-      </w:r>
-      <w:r>
-        <w:t>however this</w:t>
-      </w:r>
-      <w:r>
-        <w:t xml:space="preserve"> was changed later as </w:t>
-      </w:r>
-      <w:r>
-        <w:t>it became clear this too was out of scope</w:t>
-      </w:r>
+        <w:t>Research for the security led to me realising that the initial idea of using End-To-End encryption to stand out from other notes applications was too complicated and out of scope for this particular project. So, the security for the website was initially designed here using node.js crypto module, but no end-to-end encryption, however this was changed later as it became clear this too was out of scope.</w:t>
+      </w:r>
+    </w:p>
+    <w:p>
+      <w:pPr>
+        <w:pBdr>
+          <w:bottom w:val="single" w:sz="4" w:space="1" w:color="auto"/>
+        </w:pBdr>
+      </w:pPr>
     </w:p>
     <w:p/>
     <w:p>
@@ -3172,6 +3148,7 @@
       </w:pPr>
       <w:bookmarkStart w:id="5" w:name="_Toc228180796"/>
       <w:r>
+        <w:lastRenderedPageBreak/>
         <w:t>Sprint 3</w:t>
       </w:r>
       <w:bookmarkEnd w:id="5"/>
@@ -3186,7 +3163,6 @@
         <w:pStyle w:val="Heading4"/>
       </w:pPr>
       <w:r>
-        <w:lastRenderedPageBreak/>
         <w:t>User Stories</w:t>
       </w:r>
     </w:p>
@@ -3636,6 +3612,7 @@
           </w:tcPr>
           <w:p>
             <w:r>
+              <w:lastRenderedPageBreak/>
               <w:t>Securely hash and store the password</w:t>
             </w:r>
           </w:p>
@@ -3714,7 +3691,6 @@
         <w:pStyle w:val="Heading4"/>
       </w:pPr>
       <w:r>
-        <w:lastRenderedPageBreak/>
         <w:t>Deliverables</w:t>
       </w:r>
     </w:p>
@@ -3849,7 +3825,13 @@
           </w:tcPr>
           <w:p>
             <w:r>
-              <w:t>Add ways to chain design of note (font, font colour, font size etc)</w:t>
+              <w:t>Add ways to cha</w:t>
+            </w:r>
+            <w:r>
+              <w:t>nge</w:t>
+            </w:r>
+            <w:r>
+              <w:t xml:space="preserve"> design of note (font, font colour, font size etc)</w:t>
             </w:r>
           </w:p>
         </w:tc>
@@ -3897,6 +3879,49 @@
       </w:pPr>
       <w:r>
         <w:t>Home page will be able to link to the note page and note page will be fully functional, with files saving in browser local storage.</w:t>
+      </w:r>
+    </w:p>
+    <w:p>
+      <w:pPr>
+        <w:pStyle w:val="Heading4"/>
+      </w:pPr>
+      <w:r>
+        <w:t>Issues</w:t>
+      </w:r>
+    </w:p>
+    <w:p>
+      <w:r>
+        <w:t>There were many i</w:t>
+      </w:r>
+      <w:r>
+        <w:t>ssues with implementing ways to change the design of the note. I was using the text area element, which does not allow the text in it to be altered in anyway</w:t>
+      </w:r>
+      <w:r>
+        <w:t xml:space="preserve">. </w:t>
+      </w:r>
+      <w:r>
+        <w:t>So,</w:t>
+      </w:r>
+      <w:r>
+        <w:t xml:space="preserve"> I tried changing to a content editable element, </w:t>
+      </w:r>
+      <w:r>
+        <w:t>however,</w:t>
+      </w:r>
+      <w:r>
+        <w:t xml:space="preserve"> to retrieve the selection that the user highlighted and then change it </w:t>
+      </w:r>
+      <w:r>
+        <w:t>required libraries which are not allowed to be used. So, after a lot of trail and error, I decided to</w:t>
+      </w:r>
+      <w:r>
+        <w:t xml:space="preserve"> not implement these ideas as they were just functional requirements. </w:t>
+      </w:r>
+      <w:r>
+        <w:t xml:space="preserve">My focus on these elements also meant I </w:t>
+      </w:r>
+      <w:r>
+        <w:t>neglected the other tasks.</w:t>
       </w:r>
     </w:p>
     <w:p>
@@ -3913,15 +3938,29 @@
       <w:bookmarkEnd w:id="9"/>
     </w:p>
     <w:p>
-      <w:r>
+      <w:pPr>
+        <w:rPr>
+          <w:lang w:val="sv-SE"/>
+        </w:rPr>
+      </w:pPr>
+      <w:r>
+        <w:rPr>
+          <w:lang w:val="sv-SE"/>
+        </w:rPr>
         <w:t>18/3/2026 – 1/4/2026</w:t>
       </w:r>
     </w:p>
     <w:p>
       <w:pPr>
         <w:pStyle w:val="Heading4"/>
-      </w:pPr>
-      <w:r>
+        <w:rPr>
+          <w:lang w:val="sv-SE"/>
+        </w:rPr>
+      </w:pPr>
+      <w:r>
+        <w:rPr>
+          <w:lang w:val="sv-SE"/>
+        </w:rPr>
         <w:t>User Stories</w:t>
       </w:r>
     </w:p>
@@ -4155,6 +4194,7 @@
           </w:tcPr>
           <w:p>
             <w:r>
+              <w:lastRenderedPageBreak/>
               <w:t>Decrypt part of each note as preview</w:t>
             </w:r>
           </w:p>
@@ -4248,7 +4288,6 @@
           </w:tcPr>
           <w:p>
             <w:r>
-              <w:lastRenderedPageBreak/>
               <w:t>Task</w:t>
             </w:r>
           </w:p>
@@ -4552,14 +4591,9 @@
       <w:r>
         <w:t xml:space="preserve"> with “204 ‘nationally significant’ </w:t>
       </w:r>
-      <w:proofErr w:type="spellStart"/>
-      <w:r>
-        <w:t>cyber attack</w:t>
-      </w:r>
-      <w:r>
-        <w:t>s</w:t>
-      </w:r>
-      <w:proofErr w:type="spellEnd"/>
+      <w:r>
+        <w:t>cyber-attacks</w:t>
+      </w:r>
       <w:r>
         <w:t xml:space="preserve"> against the UK”</w:t>
       </w:r>
@@ -4907,7 +4941,7 @@
         <mc:AlternateContent>
           <mc:Choice Requires="wps">
             <w:drawing>
-              <wp:anchor distT="0" distB="0" distL="114300" distR="114300" simplePos="0" relativeHeight="251685888" behindDoc="0" locked="0" layoutInCell="1" allowOverlap="1" wp14:anchorId="2CAF661C" wp14:editId="6C1A4A7E">
+              <wp:anchor distT="0" distB="0" distL="114300" distR="114300" simplePos="0" relativeHeight="251658255" behindDoc="0" locked="0" layoutInCell="1" allowOverlap="1" wp14:anchorId="2CAF661C" wp14:editId="6C1A4A7E">
                 <wp:simplePos x="0" y="0"/>
                 <wp:positionH relativeFrom="column">
                   <wp:posOffset>3138805</wp:posOffset>
@@ -4985,7 +5019,7 @@
                 <v:stroke joinstyle="miter"/>
                 <v:path gradientshapeok="t" o:connecttype="rect"/>
               </v:shapetype>
-              <v:shape id="Text Box 1" o:spid="_x0000_s1026" type="#_x0000_t202" style="position:absolute;margin-left:247.15pt;margin-top:164.65pt;width:244.2pt;height:.05pt;z-index:251685888;visibility:visible;mso-wrap-style:square;mso-wrap-distance-left:9pt;mso-wrap-distance-top:0;mso-wrap-distance-right:9pt;mso-wrap-distance-bottom:0;mso-position-horizontal:absolute;mso-position-horizontal-relative:text;mso-position-vertical:absolute;mso-position-vertical-relative:text;v-text-anchor:top" o:gfxdata="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" stroked="f">
+              <v:shape id="Text Box 1" o:spid="_x0000_s1026" type="#_x0000_t202" style="position:absolute;margin-left:247.15pt;margin-top:164.65pt;width:244.2pt;height:.05pt;z-index:251658255;visibility:visible;mso-wrap-style:square;mso-wrap-distance-left:9pt;mso-wrap-distance-top:0;mso-wrap-distance-right:9pt;mso-wrap-distance-bottom:0;mso-position-horizontal:absolute;mso-position-horizontal-relative:text;mso-position-vertical:absolute;mso-position-vertical-relative:text;v-text-anchor:top" o:gfxdata="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" stroked="f">
                 <v:textbox style="mso-fit-shape-to-text:t" inset="0,0,0,0">
                   <w:txbxContent>
                     <w:p>
@@ -5027,7 +5061,7 @@
         <mc:AlternateContent>
           <mc:Choice Requires="wps">
             <w:drawing>
-              <wp:anchor distT="0" distB="0" distL="114300" distR="114300" simplePos="0" relativeHeight="251683840" behindDoc="0" locked="0" layoutInCell="1" allowOverlap="1" wp14:anchorId="51AEAE7D" wp14:editId="3F5299BC">
+              <wp:anchor distT="0" distB="0" distL="114300" distR="114300" simplePos="0" relativeHeight="251658254" behindDoc="0" locked="0" layoutInCell="1" allowOverlap="1" wp14:anchorId="51AEAE7D" wp14:editId="3F5299BC">
                 <wp:simplePos x="0" y="0"/>
                 <wp:positionH relativeFrom="column">
                   <wp:posOffset>-436880</wp:posOffset>
@@ -5101,7 +5135,7 @@
           </mc:Choice>
           <mc:Fallback>
             <w:pict>
-              <v:shape w14:anchorId="51AEAE7D" id="_x0000_s1027" type="#_x0000_t202" style="position:absolute;margin-left:-34.4pt;margin-top:170.4pt;width:252.9pt;height:.05pt;z-index:251683840;visibility:visible;mso-wrap-style:square;mso-wrap-distance-left:9pt;mso-wrap-distance-top:0;mso-wrap-distance-right:9pt;mso-wrap-distance-bottom:0;mso-position-horizontal:absolute;mso-position-horizontal-relative:text;mso-position-vertical:absolute;mso-position-vertical-relative:text;v-text-anchor:top" o:gfxdata="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" stroked="f">
+              <v:shape w14:anchorId="51AEAE7D" id="_x0000_s1027" type="#_x0000_t202" style="position:absolute;margin-left:-34.4pt;margin-top:170.4pt;width:252.9pt;height:.05pt;z-index:251658254;visibility:visible;mso-wrap-style:square;mso-wrap-distance-left:9pt;mso-wrap-distance-top:0;mso-wrap-distance-right:9pt;mso-wrap-distance-bottom:0;mso-position-horizontal:absolute;mso-position-horizontal-relative:text;mso-position-vertical:absolute;mso-position-vertical-relative:text;v-text-anchor:top" o:gfxdata="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" stroked="f">
                 <v:textbox style="mso-fit-shape-to-text:t" inset="0,0,0,0">
                   <w:txbxContent>
                     <w:p>
@@ -5141,7 +5175,7 @@
           <w:noProof/>
         </w:rPr>
         <w:drawing>
-          <wp:anchor distT="0" distB="0" distL="360045" distR="360045" simplePos="0" relativeHeight="251660288" behindDoc="0" locked="0" layoutInCell="1" allowOverlap="1" wp14:anchorId="3EAA9C69" wp14:editId="5C9033A8">
+          <wp:anchor distT="0" distB="0" distL="360045" distR="360045" simplePos="0" relativeHeight="251658242" behindDoc="0" locked="0" layoutInCell="1" allowOverlap="1" wp14:anchorId="3EAA9C69" wp14:editId="5C9033A8">
             <wp:simplePos x="0" y="0"/>
             <wp:positionH relativeFrom="column">
               <wp:posOffset>3138805</wp:posOffset>
@@ -5208,7 +5242,7 @@
           <w:noProof/>
         </w:rPr>
         <w:drawing>
-          <wp:anchor distT="0" distB="0" distL="114300" distR="114300" simplePos="0" relativeHeight="251658240" behindDoc="0" locked="0" layoutInCell="1" allowOverlap="1" wp14:anchorId="2DD38B25" wp14:editId="3C96D9A8">
+          <wp:anchor distT="0" distB="0" distL="114300" distR="114300" simplePos="0" relativeHeight="251658241" behindDoc="0" locked="0" layoutInCell="1" allowOverlap="1" wp14:anchorId="2DD38B25" wp14:editId="3C96D9A8">
             <wp:simplePos x="0" y="0"/>
             <wp:positionH relativeFrom="column">
               <wp:posOffset>-436880</wp:posOffset>
@@ -5277,7 +5311,7 @@
         <mc:AlternateContent>
           <mc:Choice Requires="wpi">
             <w:drawing>
-              <wp:anchor distT="0" distB="0" distL="114300" distR="114300" simplePos="0" relativeHeight="251669504" behindDoc="0" locked="0" layoutInCell="1" allowOverlap="1" wp14:anchorId="1204D359" wp14:editId="69A253E4">
+              <wp:anchor distT="0" distB="0" distL="114300" distR="114300" simplePos="0" relativeHeight="251658245" behindDoc="0" locked="0" layoutInCell="1" allowOverlap="1" wp14:anchorId="1204D359" wp14:editId="69A253E4">
                 <wp:simplePos x="0" y="0"/>
                 <wp:positionH relativeFrom="column">
                   <wp:posOffset>1250950</wp:posOffset>
@@ -5347,7 +5381,7 @@
         <mc:AlternateContent>
           <mc:Choice Requires="wps">
             <w:drawing>
-              <wp:anchor distT="0" distB="0" distL="114300" distR="114300" simplePos="0" relativeHeight="251664384" behindDoc="0" locked="0" layoutInCell="1" allowOverlap="1" wp14:anchorId="4D6D8A81" wp14:editId="74EEAD31">
+              <wp:anchor distT="0" distB="0" distL="114300" distR="114300" simplePos="0" relativeHeight="251658244" behindDoc="0" locked="0" layoutInCell="1" allowOverlap="1" wp14:anchorId="4D6D8A81" wp14:editId="74EEAD31">
                 <wp:simplePos x="0" y="0"/>
                 <wp:positionH relativeFrom="column">
                   <wp:posOffset>859846</wp:posOffset>
@@ -5440,7 +5474,7 @@
         <mc:AlternateContent>
           <mc:Choice Requires="wpi">
             <w:drawing>
-              <wp:anchor distT="0" distB="0" distL="114300" distR="114300" simplePos="0" relativeHeight="251662336" behindDoc="0" locked="0" layoutInCell="1" allowOverlap="1" wp14:anchorId="30D22623" wp14:editId="057650BF">
+              <wp:anchor distT="0" distB="0" distL="114300" distR="114300" simplePos="0" relativeHeight="251658243" behindDoc="0" locked="0" layoutInCell="1" allowOverlap="1" wp14:anchorId="30D22623" wp14:editId="057650BF">
                 <wp:simplePos x="0" y="0"/>
                 <wp:positionH relativeFrom="column">
                   <wp:posOffset>1375560</wp:posOffset>
@@ -5485,7 +5519,7 @@
           <w:noProof/>
         </w:rPr>
         <w:drawing>
-          <wp:anchor distT="0" distB="0" distL="114300" distR="114300" simplePos="0" relativeHeight="251657215" behindDoc="0" locked="0" layoutInCell="1" allowOverlap="1" wp14:anchorId="26116EE4" wp14:editId="53676792">
+          <wp:anchor distT="0" distB="0" distL="114300" distR="114300" simplePos="0" relativeHeight="251658240" behindDoc="0" locked="0" layoutInCell="1" allowOverlap="1" wp14:anchorId="26116EE4" wp14:editId="4150787D">
             <wp:simplePos x="0" y="0"/>
             <wp:positionH relativeFrom="margin">
               <wp:posOffset>1169670</wp:posOffset>
@@ -5554,7 +5588,7 @@
         <mc:AlternateContent>
           <mc:Choice Requires="wpi">
             <w:drawing>
-              <wp:anchor distT="0" distB="0" distL="114300" distR="114300" simplePos="0" relativeHeight="251671552" behindDoc="0" locked="0" layoutInCell="1" allowOverlap="1" wp14:anchorId="3E3D77BC" wp14:editId="141CDC52">
+              <wp:anchor distT="0" distB="0" distL="114300" distR="114300" simplePos="0" relativeHeight="251658246" behindDoc="0" locked="0" layoutInCell="1" allowOverlap="1" wp14:anchorId="3E3D77BC" wp14:editId="141CDC52">
                 <wp:simplePos x="0" y="0"/>
                 <wp:positionH relativeFrom="margin">
                   <wp:posOffset>1336675</wp:posOffset>
@@ -5640,7 +5674,7 @@
           <w:noProof/>
         </w:rPr>
         <w:drawing>
-          <wp:anchor distT="0" distB="0" distL="114300" distR="114300" simplePos="0" relativeHeight="251674624" behindDoc="0" locked="0" layoutInCell="1" allowOverlap="1" wp14:anchorId="705C8901" wp14:editId="0FA9CBBF">
+          <wp:anchor distT="0" distB="0" distL="114300" distR="114300" simplePos="0" relativeHeight="251658249" behindDoc="0" locked="0" layoutInCell="1" allowOverlap="1" wp14:anchorId="705C8901" wp14:editId="0FA9CBBF">
             <wp:simplePos x="0" y="0"/>
             <wp:positionH relativeFrom="margin">
               <wp:posOffset>1265555</wp:posOffset>
@@ -5709,7 +5743,7 @@
         <mc:AlternateContent>
           <mc:Choice Requires="wps">
             <w:drawing>
-              <wp:anchor distT="0" distB="0" distL="114300" distR="114300" simplePos="0" relativeHeight="251692032" behindDoc="0" locked="0" layoutInCell="1" allowOverlap="1" wp14:anchorId="5B960AB7" wp14:editId="69664F33">
+              <wp:anchor distT="0" distB="0" distL="114300" distR="114300" simplePos="0" relativeHeight="251658258" behindDoc="0" locked="0" layoutInCell="1" allowOverlap="1" wp14:anchorId="5B960AB7" wp14:editId="69664F33">
                 <wp:simplePos x="0" y="0"/>
                 <wp:positionH relativeFrom="column">
                   <wp:posOffset>2959735</wp:posOffset>
@@ -5775,7 +5809,7 @@
           </mc:Choice>
           <mc:Fallback>
             <w:pict>
-              <v:shape w14:anchorId="5B960AB7" id="_x0000_s1028" type="#_x0000_t202" style="position:absolute;margin-left:233.05pt;margin-top:206.8pt;width:228.55pt;height:16.45pt;z-index:251692032;visibility:visible;mso-wrap-style:square;mso-height-percent:0;mso-wrap-distance-left:9pt;mso-wrap-distance-top:0;mso-wrap-distance-right:9pt;mso-wrap-distance-bottom:0;mso-position-horizontal:absolute;mso-position-horizontal-relative:text;mso-position-vertical:absolute;mso-position-vertical-relative:text;mso-height-percent:0;mso-height-relative:margin;v-text-anchor:top" o:gfxdata="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" stroked="f">
+              <v:shape w14:anchorId="5B960AB7" id="_x0000_s1028" type="#_x0000_t202" style="position:absolute;margin-left:233.05pt;margin-top:206.8pt;width:228.55pt;height:16.45pt;z-index:251658258;visibility:visible;mso-wrap-style:square;mso-height-percent:0;mso-wrap-distance-left:9pt;mso-wrap-distance-top:0;mso-wrap-distance-right:9pt;mso-wrap-distance-bottom:0;mso-position-horizontal:absolute;mso-position-horizontal-relative:text;mso-position-vertical:absolute;mso-position-vertical-relative:text;mso-height-percent:0;mso-height-relative:margin;v-text-anchor:top" o:gfxdata="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" stroked="f">
                 <v:textbox inset="0,0,0,0">
                   <w:txbxContent>
                     <w:p>
@@ -5806,7 +5840,7 @@
         <mc:AlternateContent>
           <mc:Choice Requires="wps">
             <w:drawing>
-              <wp:anchor distT="0" distB="0" distL="114300" distR="114300" simplePos="0" relativeHeight="251689984" behindDoc="0" locked="0" layoutInCell="1" allowOverlap="1" wp14:anchorId="27D1F7BC" wp14:editId="2953D54B">
+              <wp:anchor distT="0" distB="0" distL="114300" distR="114300" simplePos="0" relativeHeight="251658257" behindDoc="0" locked="0" layoutInCell="1" allowOverlap="1" wp14:anchorId="27D1F7BC" wp14:editId="2953D54B">
                 <wp:simplePos x="0" y="0"/>
                 <wp:positionH relativeFrom="column">
                   <wp:posOffset>-264160</wp:posOffset>
@@ -5875,7 +5909,7 @@
           </mc:Choice>
           <mc:Fallback>
             <w:pict>
-              <v:shape w14:anchorId="27D1F7BC" id="_x0000_s1029" type="#_x0000_t202" style="position:absolute;margin-left:-20.8pt;margin-top:204.95pt;width:231.7pt;height:17.05pt;z-index:251689984;visibility:visible;mso-wrap-style:square;mso-height-percent:0;mso-wrap-distance-left:9pt;mso-wrap-distance-top:0;mso-wrap-distance-right:9pt;mso-wrap-distance-bottom:0;mso-position-horizontal:absolute;mso-position-horizontal-relative:text;mso-position-vertical:absolute;mso-position-vertical-relative:text;mso-height-percent:0;mso-height-relative:margin;v-text-anchor:top" o:gfxdata="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" stroked="f">
+              <v:shape w14:anchorId="27D1F7BC" id="_x0000_s1029" type="#_x0000_t202" style="position:absolute;margin-left:-20.8pt;margin-top:204.95pt;width:231.7pt;height:17.05pt;z-index:251658257;visibility:visible;mso-wrap-style:square;mso-height-percent:0;mso-wrap-distance-left:9pt;mso-wrap-distance-top:0;mso-wrap-distance-right:9pt;mso-wrap-distance-bottom:0;mso-position-horizontal:absolute;mso-position-horizontal-relative:text;mso-position-vertical:absolute;mso-position-vertical-relative:text;mso-height-percent:0;mso-height-relative:margin;v-text-anchor:top" o:gfxdata="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" stroked="f">
                 <v:textbox inset="0,0,0,0">
                   <w:txbxContent>
                     <w:p>
@@ -5909,7 +5943,7 @@
         <mc:AlternateContent>
           <mc:Choice Requires="wpi">
             <w:drawing>
-              <wp:anchor distT="0" distB="0" distL="114300" distR="114300" simplePos="0" relativeHeight="251680768" behindDoc="0" locked="0" layoutInCell="1" allowOverlap="1" wp14:anchorId="1F924F76" wp14:editId="463D7B4C">
+              <wp:anchor distT="0" distB="0" distL="114300" distR="114300" simplePos="0" relativeHeight="251658252" behindDoc="0" locked="0" layoutInCell="1" allowOverlap="1" wp14:anchorId="1F924F76" wp14:editId="463D7B4C">
                 <wp:simplePos x="0" y="0"/>
                 <wp:positionH relativeFrom="margin">
                   <wp:posOffset>-59690</wp:posOffset>
@@ -5959,7 +5993,7 @@
           <w:noProof/>
         </w:rPr>
         <w:drawing>
-          <wp:anchor distT="0" distB="0" distL="114300" distR="114300" simplePos="0" relativeHeight="251672576" behindDoc="0" locked="0" layoutInCell="1" allowOverlap="1" wp14:anchorId="2897FC9D" wp14:editId="62DD117E">
+          <wp:anchor distT="0" distB="0" distL="114300" distR="114300" simplePos="0" relativeHeight="251658247" behindDoc="0" locked="0" layoutInCell="1" allowOverlap="1" wp14:anchorId="2897FC9D" wp14:editId="62DD117E">
             <wp:simplePos x="0" y="0"/>
             <wp:positionH relativeFrom="column">
               <wp:posOffset>-278130</wp:posOffset>
@@ -6026,7 +6060,7 @@
           <w:noProof/>
         </w:rPr>
         <w:drawing>
-          <wp:anchor distT="0" distB="0" distL="114300" distR="114300" simplePos="0" relativeHeight="251673600" behindDoc="0" locked="0" layoutInCell="1" allowOverlap="1" wp14:anchorId="71AC2A9F" wp14:editId="49FCA924">
+          <wp:anchor distT="0" distB="0" distL="114300" distR="114300" simplePos="0" relativeHeight="251658248" behindDoc="0" locked="0" layoutInCell="1" allowOverlap="1" wp14:anchorId="71AC2A9F" wp14:editId="49FCA924">
             <wp:simplePos x="0" y="0"/>
             <wp:positionH relativeFrom="margin">
               <wp:posOffset>2962910</wp:posOffset>
@@ -6095,7 +6129,7 @@
         <mc:AlternateContent>
           <mc:Choice Requires="wps">
             <w:drawing>
-              <wp:anchor distT="0" distB="0" distL="114300" distR="114300" simplePos="0" relativeHeight="251687936" behindDoc="0" locked="0" layoutInCell="1" allowOverlap="1" wp14:anchorId="1625C4DB" wp14:editId="11859E81">
+              <wp:anchor distT="0" distB="0" distL="114300" distR="114300" simplePos="0" relativeHeight="251658256" behindDoc="0" locked="0" layoutInCell="1" allowOverlap="1" wp14:anchorId="1625C4DB" wp14:editId="11859E81">
                 <wp:simplePos x="0" y="0"/>
                 <wp:positionH relativeFrom="column">
                   <wp:posOffset>1168400</wp:posOffset>
@@ -6162,7 +6196,7 @@
           </mc:Choice>
           <mc:Fallback>
             <w:pict>
-              <v:shape w14:anchorId="1625C4DB" id="_x0000_s1030" type="#_x0000_t202" style="position:absolute;margin-left:92pt;margin-top:45.7pt;width:267.3pt;height:.05pt;z-index:251687936;visibility:visible;mso-wrap-style:square;mso-wrap-distance-left:9pt;mso-wrap-distance-top:0;mso-wrap-distance-right:9pt;mso-wrap-distance-bottom:0;mso-position-horizontal:absolute;mso-position-horizontal-relative:text;mso-position-vertical:absolute;mso-position-vertical-relative:text;v-text-anchor:top" o:gfxdata="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" stroked="f">
+              <v:shape w14:anchorId="1625C4DB" id="_x0000_s1030" type="#_x0000_t202" style="position:absolute;margin-left:92pt;margin-top:45.7pt;width:267.3pt;height:.05pt;z-index:251658256;visibility:visible;mso-wrap-style:square;mso-wrap-distance-left:9pt;mso-wrap-distance-top:0;mso-wrap-distance-right:9pt;mso-wrap-distance-bottom:0;mso-position-horizontal:absolute;mso-position-horizontal-relative:text;mso-position-vertical:absolute;mso-position-vertical-relative:text;v-text-anchor:top" o:gfxdata="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" stroked="f">
                 <v:textbox style="mso-fit-shape-to-text:t" inset="0,0,0,0">
                   <w:txbxContent>
                     <w:p>
@@ -6197,7 +6231,7 @@
         <mc:AlternateContent>
           <mc:Choice Requires="wps">
             <w:drawing>
-              <wp:anchor distT="0" distB="0" distL="114300" distR="114300" simplePos="0" relativeHeight="251694080" behindDoc="0" locked="0" layoutInCell="1" allowOverlap="1" wp14:anchorId="5DB62136" wp14:editId="59E85A44">
+              <wp:anchor distT="0" distB="0" distL="114300" distR="114300" simplePos="0" relativeHeight="251658259" behindDoc="0" locked="0" layoutInCell="1" allowOverlap="1" wp14:anchorId="5DB62136" wp14:editId="59E85A44">
                 <wp:simplePos x="0" y="0"/>
                 <wp:positionH relativeFrom="column">
                   <wp:posOffset>1263015</wp:posOffset>
@@ -6263,7 +6297,7 @@
           </mc:Choice>
           <mc:Fallback>
             <w:pict>
-              <v:shape w14:anchorId="5DB62136" id="_x0000_s1031" type="#_x0000_t202" style="position:absolute;margin-left:99.45pt;margin-top:359.6pt;width:251.5pt;height:15.25pt;z-index:251694080;visibility:visible;mso-wrap-style:square;mso-height-percent:0;mso-wrap-distance-left:9pt;mso-wrap-distance-top:0;mso-wrap-distance-right:9pt;mso-wrap-distance-bottom:0;mso-position-horizontal:absolute;mso-position-horizontal-relative:text;mso-position-vertical:absolute;mso-position-vertical-relative:text;mso-height-percent:0;mso-height-relative:margin;v-text-anchor:top" o:gfxdata="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" stroked="f">
+              <v:shape w14:anchorId="5DB62136" id="_x0000_s1031" type="#_x0000_t202" style="position:absolute;margin-left:99.45pt;margin-top:359.6pt;width:251.5pt;height:15.25pt;z-index:251658259;visibility:visible;mso-wrap-style:square;mso-height-percent:0;mso-wrap-distance-left:9pt;mso-wrap-distance-top:0;mso-wrap-distance-right:9pt;mso-wrap-distance-bottom:0;mso-position-horizontal:absolute;mso-position-horizontal-relative:text;mso-position-vertical:absolute;mso-position-vertical-relative:text;mso-height-percent:0;mso-height-relative:margin;v-text-anchor:top" o:gfxdata="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" stroked="f">
                 <v:textbox inset="0,0,0,0">
                   <w:txbxContent>
                     <w:p>
@@ -6294,7 +6328,7 @@
         <mc:AlternateContent>
           <mc:Choice Requires="wpi">
             <w:drawing>
-              <wp:anchor distT="0" distB="0" distL="114300" distR="114300" simplePos="0" relativeHeight="251678720" behindDoc="0" locked="0" layoutInCell="1" allowOverlap="1" wp14:anchorId="29E3ACEC" wp14:editId="0C1A6916">
+              <wp:anchor distT="0" distB="0" distL="114300" distR="114300" simplePos="0" relativeHeight="251658251" behindDoc="0" locked="0" layoutInCell="1" allowOverlap="1" wp14:anchorId="29E3ACEC" wp14:editId="0C1A6916">
                 <wp:simplePos x="0" y="0"/>
                 <wp:positionH relativeFrom="margin">
                   <wp:posOffset>3403600</wp:posOffset>
@@ -6346,7 +6380,7 @@
         <mc:AlternateContent>
           <mc:Choice Requires="wpi">
             <w:drawing>
-              <wp:anchor distT="0" distB="0" distL="114300" distR="114300" simplePos="0" relativeHeight="251676672" behindDoc="0" locked="0" layoutInCell="1" allowOverlap="1" wp14:anchorId="227DDDAD" wp14:editId="4277F83A">
+              <wp:anchor distT="0" distB="0" distL="114300" distR="114300" simplePos="0" relativeHeight="251658250" behindDoc="0" locked="0" layoutInCell="1" allowOverlap="1" wp14:anchorId="227DDDAD" wp14:editId="4277F83A">
                 <wp:simplePos x="0" y="0"/>
                 <wp:positionH relativeFrom="margin">
                   <wp:posOffset>2305050</wp:posOffset>
@@ -6412,7 +6446,7 @@
         <mc:AlternateContent>
           <mc:Choice Requires="wps">
             <w:drawing>
-              <wp:anchor distT="0" distB="0" distL="114300" distR="114300" simplePos="0" relativeHeight="251696128" behindDoc="0" locked="0" layoutInCell="1" allowOverlap="1" wp14:anchorId="0127D232" wp14:editId="199B6489">
+              <wp:anchor distT="0" distB="0" distL="114300" distR="114300" simplePos="0" relativeHeight="251658260" behindDoc="0" locked="0" layoutInCell="1" allowOverlap="1" wp14:anchorId="0127D232" wp14:editId="199B6489">
                 <wp:simplePos x="0" y="0"/>
                 <wp:positionH relativeFrom="column">
                   <wp:posOffset>819150</wp:posOffset>
@@ -6475,7 +6509,7 @@
           </mc:Choice>
           <mc:Fallback>
             <w:pict>
-              <v:shape w14:anchorId="0127D232" id="_x0000_s1032" type="#_x0000_t202" style="position:absolute;margin-left:64.5pt;margin-top:195.25pt;width:312pt;height:.05pt;z-index:251696128;visibility:visible;mso-wrap-style:square;mso-wrap-distance-left:9pt;mso-wrap-distance-top:0;mso-wrap-distance-right:9pt;mso-wrap-distance-bottom:0;mso-position-horizontal:absolute;mso-position-horizontal-relative:text;mso-position-vertical:absolute;mso-position-vertical-relative:text;v-text-anchor:top" o:gfxdata="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" stroked="f">
+              <v:shape w14:anchorId="0127D232" id="_x0000_s1032" type="#_x0000_t202" style="position:absolute;margin-left:64.5pt;margin-top:195.25pt;width:312pt;height:.05pt;z-index:251658260;visibility:visible;mso-wrap-style:square;mso-wrap-distance-left:9pt;mso-wrap-distance-top:0;mso-wrap-distance-right:9pt;mso-wrap-distance-bottom:0;mso-position-horizontal:absolute;mso-position-horizontal-relative:text;mso-position-vertical:absolute;mso-position-vertical-relative:text;v-text-anchor:top" o:gfxdata="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" stroked="f">
                 <v:textbox style="mso-fit-shape-to-text:t" inset="0,0,0,0">
                   <w:txbxContent>
                     <w:p>
@@ -6504,7 +6538,7 @@
           <w:noProof/>
         </w:rPr>
         <w:drawing>
-          <wp:anchor distT="0" distB="0" distL="114300" distR="114300" simplePos="0" relativeHeight="251681792" behindDoc="0" locked="0" layoutInCell="1" allowOverlap="1" wp14:anchorId="65222AB2" wp14:editId="3260ADCD">
+          <wp:anchor distT="0" distB="0" distL="114300" distR="114300" simplePos="0" relativeHeight="251658253" behindDoc="0" locked="0" layoutInCell="1" allowOverlap="1" wp14:anchorId="65222AB2" wp14:editId="3260ADCD">
             <wp:simplePos x="0" y="0"/>
             <wp:positionH relativeFrom="column">
               <wp:posOffset>819150</wp:posOffset>
@@ -6887,7 +6921,16 @@
         <w:t xml:space="preserve">hashing algorithm works. It is based on the algorithm </w:t>
       </w:r>
       <w:r>
-        <w:t>MD5;</w:t>
+        <w:t>MD5</w:t>
+      </w:r>
+      <w:r>
+        <w:t>, which is a cryptographic hash function</w:t>
+      </w:r>
+      <w:r>
+        <w:t xml:space="preserve"> (Kumar, 2025)</w:t>
+      </w:r>
+      <w:r>
+        <w:t>;</w:t>
       </w:r>
       <w:r>
         <w:t xml:space="preserve"> however</w:t>
@@ -6896,7 +6939,10 @@
         <w:t>,</w:t>
       </w:r>
       <w:r>
-        <w:t xml:space="preserve"> it is simplified by not including [something, google when have internet]</w:t>
+        <w:t xml:space="preserve"> it is simplified</w:t>
+      </w:r>
+      <w:r>
+        <w:t xml:space="preserve"> to make it easier to implement</w:t>
       </w:r>
       <w:r>
         <w:t>.</w:t>
@@ -7126,12 +7172,12 @@
     </w:p>
     <w:p>
       <w:pPr>
-        <w:rPr>
-          <w:rFonts w:asciiTheme="majorHAnsi" w:eastAsiaTheme="majorEastAsia" w:hAnsiTheme="majorHAnsi" w:cstheme="majorBidi"/>
-          <w:color w:val="0F4761" w:themeColor="accent1" w:themeShade="BF"/>
-          <w:sz w:val="40"/>
-          <w:szCs w:val="40"/>
-        </w:rPr>
+        <w:sectPr>
+          <w:pgSz w:w="11906" w:h="16838"/>
+          <w:pgMar w:top="1440" w:right="1440" w:bottom="1440" w:left="1440" w:header="708" w:footer="708" w:gutter="0"/>
+          <w:cols w:space="708"/>
+          <w:docGrid w:linePitch="360"/>
+        </w:sectPr>
       </w:pPr>
       <w:r>
         <w:br w:type="page"/>
@@ -7296,7 +7342,7 @@
     </w:p>
     <w:p>
       <w:r>
-        <w:t xml:space="preserve">Finally, I also had to </w:t>
+        <w:t xml:space="preserve">I also had to </w:t>
       </w:r>
       <w:r>
         <w:t>consider</w:t>
@@ -7390,19 +7436,37 @@
       <w:bookmarkEnd w:id="24"/>
     </w:p>
     <w:p>
-      <w:r>
-        <w:t>Link here</w:t>
-      </w:r>
-    </w:p>
-    <w:p>
-      <w:pPr>
-        <w:rPr>
-          <w:rFonts w:asciiTheme="majorHAnsi" w:eastAsiaTheme="majorEastAsia" w:hAnsiTheme="majorHAnsi" w:cstheme="majorBidi"/>
-          <w:color w:val="0F4761" w:themeColor="accent1" w:themeShade="BF"/>
-          <w:sz w:val="40"/>
-          <w:szCs w:val="40"/>
-        </w:rPr>
-      </w:pPr>
+      <w:hyperlink r:id="rId30" w:history="1">
+        <w:r>
+          <w:rPr>
+            <w:rStyle w:val="Hyperlink"/>
+          </w:rPr>
+          <w:t>https://github.com/hedwignu/HeidiGinnaw-COMP1004</w:t>
+        </w:r>
+      </w:hyperlink>
+      <w:r>
+        <w:t xml:space="preserve"> </w:t>
+      </w:r>
+    </w:p>
+    <w:p>
+      <w:pPr>
+        <w:pStyle w:val="Caption"/>
+        <w:sectPr>
+          <w:pgSz w:w="11906" w:h="16838"/>
+          <w:pgMar w:top="1440" w:right="1440" w:bottom="1440" w:left="1440" w:header="708" w:footer="708" w:gutter="0"/>
+          <w:cols w:space="708"/>
+          <w:docGrid w:linePitch="360"/>
+        </w:sectPr>
+      </w:pPr>
+      <w:r>
+        <w:t xml:space="preserve">Note: </w:t>
+      </w:r>
+      <w:r>
+        <w:t>I worked on a branch called test for a couple of months and only merged</w:t>
+      </w:r>
+      <w:r>
+        <w:t xml:space="preserve"> it to master recently, so a lot of my commits are on test.</w:t>
+      </w:r>
       <w:r>
         <w:br w:type="page"/>
       </w:r>
@@ -8423,7 +8487,7 @@
       <w:r>
         <w:t xml:space="preserve">. Available at: </w:t>
       </w:r>
-      <w:hyperlink r:id="rId30" w:history="1">
+      <w:hyperlink r:id="rId31" w:history="1">
         <w:r>
           <w:rPr>
             <w:rStyle w:val="Hyperlink"/>
@@ -8487,7 +8551,7 @@
       <w:r>
         <w:t xml:space="preserve">Available at: </w:t>
       </w:r>
-      <w:hyperlink r:id="rId31" w:history="1">
+      <w:hyperlink r:id="rId32" w:history="1">
         <w:r>
           <w:rPr>
             <w:rStyle w:val="Hyperlink"/>
@@ -8520,7 +8584,7 @@
       <w:r>
         <w:t xml:space="preserve">Available at: </w:t>
       </w:r>
-      <w:hyperlink r:id="rId32" w:history="1">
+      <w:hyperlink r:id="rId33" w:history="1">
         <w:r>
           <w:rPr>
             <w:rStyle w:val="Hyperlink"/>
@@ -8552,7 +8616,7 @@
       <w:r>
         <w:t xml:space="preserve"> Available at: </w:t>
       </w:r>
-      <w:hyperlink r:id="rId33" w:history="1">
+      <w:hyperlink r:id="rId34" w:history="1">
         <w:r>
           <w:rPr>
             <w:rStyle w:val="Hyperlink"/>
@@ -8588,7 +8652,7 @@
       <w:r>
         <w:t xml:space="preserve">Available at: </w:t>
       </w:r>
-      <w:hyperlink r:id="rId34" w:history="1">
+      <w:hyperlink r:id="rId35" w:history="1">
         <w:r>
           <w:rPr>
             <w:rStyle w:val="Hyperlink"/>
@@ -8614,7 +8678,7 @@
       <w:r>
         <w:t xml:space="preserve">Available at: </w:t>
       </w:r>
-      <w:hyperlink r:id="rId35" w:history="1">
+      <w:hyperlink r:id="rId36" w:history="1">
         <w:r>
           <w:rPr>
             <w:rStyle w:val="Hyperlink"/>
@@ -8655,7 +8719,7 @@
       <w:r>
         <w:t xml:space="preserve">Available at: </w:t>
       </w:r>
-      <w:hyperlink r:id="rId36" w:history="1">
+      <w:hyperlink r:id="rId37" w:history="1">
         <w:r>
           <w:rPr>
             <w:rStyle w:val="Hyperlink"/>
@@ -8707,7 +8771,7 @@
       <w:r>
         <w:t xml:space="preserve"> </w:t>
       </w:r>
-      <w:hyperlink r:id="rId37" w:history="1">
+      <w:hyperlink r:id="rId38" w:history="1">
         <w:r>
           <w:rPr>
             <w:rStyle w:val="Hyperlink"/>
@@ -8762,7 +8826,7 @@
       <w:r>
         <w:t xml:space="preserve"> </w:t>
       </w:r>
-      <w:hyperlink r:id="rId38" w:history="1">
+      <w:hyperlink r:id="rId39" w:history="1">
         <w:r>
           <w:rPr>
             <w:rStyle w:val="Hyperlink"/>
@@ -8795,7 +8859,7 @@
       <w:r>
         <w:t xml:space="preserve">Available at: </w:t>
       </w:r>
-      <w:hyperlink r:id="rId39" w:history="1">
+      <w:hyperlink r:id="rId40" w:history="1">
         <w:r>
           <w:rPr>
             <w:rStyle w:val="Hyperlink"/>
@@ -8828,7 +8892,7 @@
       <w:r>
         <w:t xml:space="preserve">. Available at: </w:t>
       </w:r>
-      <w:hyperlink r:id="rId40" w:history="1">
+      <w:hyperlink r:id="rId41" w:history="1">
         <w:r>
           <w:rPr>
             <w:rStyle w:val="Hyperlink"/>
@@ -8844,7 +8908,7 @@
       <w:r>
         <w:t xml:space="preserve">UpNote (2026) Available at: </w:t>
       </w:r>
-      <w:hyperlink r:id="rId41" w:history="1">
+      <w:hyperlink r:id="rId42" w:history="1">
         <w:r>
           <w:rPr>
             <w:rStyle w:val="Hyperlink"/>
@@ -8892,7 +8956,7 @@
       <w:r>
         <w:t xml:space="preserve">Available at: </w:t>
       </w:r>
-      <w:hyperlink r:id="rId42" w:history="1">
+      <w:hyperlink r:id="rId43" w:history="1">
         <w:r>
           <w:rPr>
             <w:rStyle w:val="Hyperlink"/>
@@ -8905,6 +8969,54 @@
       </w:r>
     </w:p>
     <w:p>
+      <w:pPr>
+        <w:rPr>
+          <w:b/>
+          <w:bCs/>
+          <w:lang w:val="en-US"/>
+        </w:rPr>
+      </w:pPr>
+      <w:r>
+        <w:t xml:space="preserve">Kumar, S (2025) </w:t>
+      </w:r>
+      <w:r>
+        <w:rPr>
+          <w:i/>
+          <w:iCs/>
+        </w:rPr>
+        <w:t>What is the MD5 Algorithm</w:t>
+      </w:r>
+      <w:r>
+        <w:rPr>
+          <w:i/>
+          <w:iCs/>
+          <w:lang w:val="en-US"/>
+        </w:rPr>
+        <w:t xml:space="preserve">? </w:t>
+      </w:r>
+      <w:r>
+        <w:rPr>
+          <w:lang w:val="en-US"/>
+        </w:rPr>
+        <w:t xml:space="preserve">Available at: </w:t>
+      </w:r>
+      <w:hyperlink r:id="rId44" w:history="1">
+        <w:r>
+          <w:rPr>
+            <w:rStyle w:val="Hyperlink"/>
+            <w:lang w:val="en-US"/>
+          </w:rPr>
+          <w:t>https://www.geeksforgeeks.org/computer-networks/what-is-the-md5-algorithm/</w:t>
+        </w:r>
+      </w:hyperlink>
+      <w:r>
+        <w:rPr>
+          <w:lang w:val="en-US"/>
+        </w:rPr>
+        <w:t xml:space="preserve"> (Accessed: 28/04/2026)</w:t>
+      </w:r>
+    </w:p>
+    <w:p>
       <w:r>
         <w:rPr>
           <w:i/>
@@ -8924,7 +9036,7 @@
       <w:r>
         <w:t xml:space="preserve"> </w:t>
       </w:r>
-      <w:hyperlink r:id="rId43" w:history="1">
+      <w:hyperlink r:id="rId45" w:history="1">
         <w:r>
           <w:rPr>
             <w:rStyle w:val="Hyperlink"/>
@@ -10224,7 +10336,6 @@
   <w:style w:type="character" w:default="1" w:styleId="DefaultParagraphFont">
     <w:name w:val="Default Paragraph Font"/>
     <w:uiPriority w:val="1"/>
-    <w:semiHidden/>
     <w:unhideWhenUsed/>
   </w:style>
   <w:style w:type="table" w:default="1" w:styleId="TableNormal">

</xml_diff>